<commit_message>
updated dynamice doc file
</commit_message>
<xml_diff>
--- a/how to setup dynamic inventory.docx
+++ b/how to setup dynamic inventory.docx
@@ -153,16 +153,29 @@
           <w14:ligatures w14:val="none"/>
         </w:rPr>
       </w:pPr>
-      <w:r>
-        <w:rPr>
-          <w:rFonts w:ascii="Courier New" w:eastAsia="Times New Roman" w:hAnsi="Courier New" w:cs="Courier New"/>
-          <w:kern w:val="0"/>
-          <w:sz w:val="20"/>
-          <w:szCs w:val="20"/>
-          <w:lang w:eastAsia="en-IN"/>
-          <w14:ligatures w14:val="none"/>
-        </w:rPr>
-        <w:t>sudo apt update</w:t>
+      <w:proofErr w:type="spellStart"/>
+      <w:r>
+        <w:rPr>
+          <w:rFonts w:ascii="Courier New" w:eastAsia="Times New Roman" w:hAnsi="Courier New" w:cs="Courier New"/>
+          <w:kern w:val="0"/>
+          <w:sz w:val="20"/>
+          <w:szCs w:val="20"/>
+          <w:lang w:eastAsia="en-IN"/>
+          <w14:ligatures w14:val="none"/>
+        </w:rPr>
+        <w:t>sudo</w:t>
+      </w:r>
+      <w:proofErr w:type="spellEnd"/>
+      <w:r>
+        <w:rPr>
+          <w:rFonts w:ascii="Courier New" w:eastAsia="Times New Roman" w:hAnsi="Courier New" w:cs="Courier New"/>
+          <w:kern w:val="0"/>
+          <w:sz w:val="20"/>
+          <w:szCs w:val="20"/>
+          <w:lang w:eastAsia="en-IN"/>
+          <w14:ligatures w14:val="none"/>
+        </w:rPr>
+        <w:t xml:space="preserve"> apt update</w:t>
       </w:r>
       <w:r>
         <w:rPr>
@@ -174,7 +187,54 @@
           <w14:ligatures w14:val="none"/>
         </w:rPr>
         <w:br/>
-        <w:t>sudo apt install python3-boto3 python3-botocore awscli -y</w:t>
+      </w:r>
+      <w:proofErr w:type="spellStart"/>
+      <w:r>
+        <w:rPr>
+          <w:rFonts w:ascii="Courier New" w:eastAsia="Times New Roman" w:hAnsi="Courier New" w:cs="Courier New"/>
+          <w:kern w:val="0"/>
+          <w:sz w:val="20"/>
+          <w:szCs w:val="20"/>
+          <w:lang w:eastAsia="en-IN"/>
+          <w14:ligatures w14:val="none"/>
+        </w:rPr>
+        <w:t>sudo</w:t>
+      </w:r>
+      <w:proofErr w:type="spellEnd"/>
+      <w:r>
+        <w:rPr>
+          <w:rFonts w:ascii="Courier New" w:eastAsia="Times New Roman" w:hAnsi="Courier New" w:cs="Courier New"/>
+          <w:kern w:val="0"/>
+          <w:sz w:val="20"/>
+          <w:szCs w:val="20"/>
+          <w:lang w:eastAsia="en-IN"/>
+          <w14:ligatures w14:val="none"/>
+        </w:rPr>
+        <w:t xml:space="preserve"> apt install python3-boto3 python3-botocore </w:t>
+      </w:r>
+      <w:proofErr w:type="spellStart"/>
+      <w:r>
+        <w:rPr>
+          <w:rFonts w:ascii="Courier New" w:eastAsia="Times New Roman" w:hAnsi="Courier New" w:cs="Courier New"/>
+          <w:kern w:val="0"/>
+          <w:sz w:val="20"/>
+          <w:szCs w:val="20"/>
+          <w:lang w:eastAsia="en-IN"/>
+          <w14:ligatures w14:val="none"/>
+        </w:rPr>
+        <w:t>awscli</w:t>
+      </w:r>
+      <w:proofErr w:type="spellEnd"/>
+      <w:r>
+        <w:rPr>
+          <w:rFonts w:ascii="Courier New" w:eastAsia="Times New Roman" w:hAnsi="Courier New" w:cs="Courier New"/>
+          <w:kern w:val="0"/>
+          <w:sz w:val="20"/>
+          <w:szCs w:val="20"/>
+          <w:lang w:eastAsia="en-IN"/>
+          <w14:ligatures w14:val="none"/>
+        </w:rPr>
+        <w:t xml:space="preserve"> -y</w:t>
       </w:r>
     </w:p>
     <w:p>
@@ -198,7 +258,7 @@
           <w:lang w:eastAsia="en-IN"/>
           <w14:ligatures w14:val="none"/>
         </w:rPr>
-        <w:pict w14:anchorId="00FC0AB4">
+        <w:pict w14:anchorId="583B9C2D">
           <v:rect id="_x0000_i1025" style="width:0;height:1.5pt" o:hralign="center" o:hrstd="t" o:hr="t" fillcolor="#a0a0a0" stroked="f"/>
         </w:pict>
       </w:r>
@@ -297,8 +357,45 @@
           <w:lang w:eastAsia="en-IN"/>
           <w14:ligatures w14:val="none"/>
         </w:rPr>
-        <w:t>ansible-galaxy collection install amazon.aws</w:t>
-      </w:r>
+        <w:t xml:space="preserve">ansible-galaxy collection </w:t>
+      </w:r>
+      <w:proofErr w:type="gramStart"/>
+      <w:r>
+        <w:rPr>
+          <w:rFonts w:ascii="Courier New" w:eastAsia="Times New Roman" w:hAnsi="Courier New" w:cs="Courier New"/>
+          <w:kern w:val="0"/>
+          <w:sz w:val="20"/>
+          <w:szCs w:val="20"/>
+          <w:lang w:eastAsia="en-IN"/>
+          <w14:ligatures w14:val="none"/>
+        </w:rPr>
+        <w:t>install</w:t>
+      </w:r>
+      <w:proofErr w:type="gramEnd"/>
+      <w:r>
+        <w:rPr>
+          <w:rFonts w:ascii="Courier New" w:eastAsia="Times New Roman" w:hAnsi="Courier New" w:cs="Courier New"/>
+          <w:kern w:val="0"/>
+          <w:sz w:val="20"/>
+          <w:szCs w:val="20"/>
+          <w:lang w:eastAsia="en-IN"/>
+          <w14:ligatures w14:val="none"/>
+        </w:rPr>
+        <w:t xml:space="preserve"> </w:t>
+      </w:r>
+      <w:proofErr w:type="spellStart"/>
+      <w:r>
+        <w:rPr>
+          <w:rFonts w:ascii="Courier New" w:eastAsia="Times New Roman" w:hAnsi="Courier New" w:cs="Courier New"/>
+          <w:kern w:val="0"/>
+          <w:sz w:val="20"/>
+          <w:szCs w:val="20"/>
+          <w:lang w:eastAsia="en-IN"/>
+          <w14:ligatures w14:val="none"/>
+        </w:rPr>
+        <w:t>amazon.aws</w:t>
+      </w:r>
+      <w:proofErr w:type="spellEnd"/>
     </w:p>
     <w:p>
       <w:pPr>
@@ -387,7 +484,7 @@
           <w:lang w:eastAsia="en-IN"/>
           <w14:ligatures w14:val="none"/>
         </w:rPr>
-        <w:pict w14:anchorId="60334533">
+        <w:pict w14:anchorId="583B9C2E">
           <v:rect id="_x0000_i1026" style="width:0;height:1.5pt" o:hralign="center" o:hrstd="t" o:hr="t" fillcolor="#a0a0a0" stroked="f"/>
         </w:pict>
       </w:r>
@@ -501,16 +598,29 @@
           <w14:ligatures w14:val="none"/>
         </w:rPr>
       </w:pPr>
-      <w:r>
-        <w:rPr>
-          <w:rFonts w:ascii="Courier New" w:eastAsia="Times New Roman" w:hAnsi="Courier New" w:cs="Courier New"/>
-          <w:kern w:val="0"/>
-          <w:sz w:val="20"/>
-          <w:szCs w:val="20"/>
-          <w:lang w:eastAsia="en-IN"/>
-          <w14:ligatures w14:val="none"/>
-        </w:rPr>
-        <w:t>aws configure</w:t>
+      <w:proofErr w:type="spellStart"/>
+      <w:r>
+        <w:rPr>
+          <w:rFonts w:ascii="Courier New" w:eastAsia="Times New Roman" w:hAnsi="Courier New" w:cs="Courier New"/>
+          <w:kern w:val="0"/>
+          <w:sz w:val="20"/>
+          <w:szCs w:val="20"/>
+          <w:lang w:eastAsia="en-IN"/>
+          <w14:ligatures w14:val="none"/>
+        </w:rPr>
+        <w:t>aws</w:t>
+      </w:r>
+      <w:proofErr w:type="spellEnd"/>
+      <w:r>
+        <w:rPr>
+          <w:rFonts w:ascii="Courier New" w:eastAsia="Times New Roman" w:hAnsi="Courier New" w:cs="Courier New"/>
+          <w:kern w:val="0"/>
+          <w:sz w:val="20"/>
+          <w:szCs w:val="20"/>
+          <w:lang w:eastAsia="en-IN"/>
+          <w14:ligatures w14:val="none"/>
+        </w:rPr>
+        <w:t xml:space="preserve"> configure</w:t>
       </w:r>
     </w:p>
     <w:p>
@@ -684,7 +794,7 @@
           <w:lang w:eastAsia="en-IN"/>
           <w14:ligatures w14:val="none"/>
         </w:rPr>
-        <w:pict w14:anchorId="29F29D02">
+        <w:pict w14:anchorId="583B9C2F">
           <v:rect id="_x0000_i1027" style="width:0;height:1.5pt" o:hralign="center" o:hrstd="t" o:hr="t" fillcolor="#a0a0a0" stroked="f"/>
         </w:pict>
       </w:r>
@@ -965,7 +1075,31 @@
           <w14:ligatures w14:val="none"/>
         </w:rPr>
         <w:br/>
-        <w:t xml:space="preserve">  - private-ip-address</w:t>
+        <w:t xml:space="preserve">  - private-</w:t>
+      </w:r>
+      <w:proofErr w:type="spellStart"/>
+      <w:r>
+        <w:rPr>
+          <w:rFonts w:ascii="Courier New" w:eastAsia="Times New Roman" w:hAnsi="Courier New" w:cs="Courier New"/>
+          <w:kern w:val="0"/>
+          <w:sz w:val="20"/>
+          <w:szCs w:val="20"/>
+          <w:lang w:eastAsia="en-IN"/>
+          <w14:ligatures w14:val="none"/>
+        </w:rPr>
+        <w:t>ip</w:t>
+      </w:r>
+      <w:proofErr w:type="spellEnd"/>
+      <w:r>
+        <w:rPr>
+          <w:rFonts w:ascii="Courier New" w:eastAsia="Times New Roman" w:hAnsi="Courier New" w:cs="Courier New"/>
+          <w:kern w:val="0"/>
+          <w:sz w:val="20"/>
+          <w:szCs w:val="20"/>
+          <w:lang w:eastAsia="en-IN"/>
+          <w14:ligatures w14:val="none"/>
+        </w:rPr>
+        <w:t>-address</w:t>
       </w:r>
       <w:r>
         <w:rPr>
@@ -1000,8 +1134,45 @@
           <w14:ligatures w14:val="none"/>
         </w:rPr>
         <w:br/>
-        <w:t xml:space="preserve">  ansible_host: private_ip_address</w:t>
-      </w:r>
+        <w:t xml:space="preserve">  </w:t>
+      </w:r>
+      <w:proofErr w:type="spellStart"/>
+      <w:r>
+        <w:rPr>
+          <w:rFonts w:ascii="Courier New" w:eastAsia="Times New Roman" w:hAnsi="Courier New" w:cs="Courier New"/>
+          <w:kern w:val="0"/>
+          <w:sz w:val="20"/>
+          <w:szCs w:val="20"/>
+          <w:lang w:eastAsia="en-IN"/>
+          <w14:ligatures w14:val="none"/>
+        </w:rPr>
+        <w:t>ansible_host</w:t>
+      </w:r>
+      <w:proofErr w:type="spellEnd"/>
+      <w:r>
+        <w:rPr>
+          <w:rFonts w:ascii="Courier New" w:eastAsia="Times New Roman" w:hAnsi="Courier New" w:cs="Courier New"/>
+          <w:kern w:val="0"/>
+          <w:sz w:val="20"/>
+          <w:szCs w:val="20"/>
+          <w:lang w:eastAsia="en-IN"/>
+          <w14:ligatures w14:val="none"/>
+        </w:rPr>
+        <w:t xml:space="preserve">: </w:t>
+      </w:r>
+      <w:proofErr w:type="spellStart"/>
+      <w:r>
+        <w:rPr>
+          <w:rFonts w:ascii="Courier New" w:eastAsia="Times New Roman" w:hAnsi="Courier New" w:cs="Courier New"/>
+          <w:kern w:val="0"/>
+          <w:sz w:val="20"/>
+          <w:szCs w:val="20"/>
+          <w:lang w:eastAsia="en-IN"/>
+          <w14:ligatures w14:val="none"/>
+        </w:rPr>
+        <w:t>private_ip_address</w:t>
+      </w:r>
+      <w:proofErr w:type="spellEnd"/>
       <w:r>
         <w:rPr>
           <w:rFonts w:ascii="Courier New" w:eastAsia="Times New Roman" w:hAnsi="Courier New" w:cs="Courier New"/>
@@ -1023,7 +1194,30 @@
           <w14:ligatures w14:val="none"/>
         </w:rPr>
         <w:br/>
-        <w:t>keyed_groups:</w:t>
+      </w:r>
+      <w:proofErr w:type="spellStart"/>
+      <w:r>
+        <w:rPr>
+          <w:rFonts w:ascii="Courier New" w:eastAsia="Times New Roman" w:hAnsi="Courier New" w:cs="Courier New"/>
+          <w:kern w:val="0"/>
+          <w:sz w:val="20"/>
+          <w:szCs w:val="20"/>
+          <w:lang w:eastAsia="en-IN"/>
+          <w14:ligatures w14:val="none"/>
+        </w:rPr>
+        <w:t>keyed_groups</w:t>
+      </w:r>
+      <w:proofErr w:type="spellEnd"/>
+      <w:r>
+        <w:rPr>
+          <w:rFonts w:ascii="Courier New" w:eastAsia="Times New Roman" w:hAnsi="Courier New" w:cs="Courier New"/>
+          <w:kern w:val="0"/>
+          <w:sz w:val="20"/>
+          <w:szCs w:val="20"/>
+          <w:lang w:eastAsia="en-IN"/>
+          <w14:ligatures w14:val="none"/>
+        </w:rPr>
+        <w:t>:</w:t>
       </w:r>
       <w:r>
         <w:rPr>
@@ -1035,8 +1229,21 @@
           <w14:ligatures w14:val="none"/>
         </w:rPr>
         <w:br/>
-        <w:t xml:space="preserve">  - key: tags.env</w:t>
-      </w:r>
+        <w:t xml:space="preserve">  - key: </w:t>
+      </w:r>
+      <w:proofErr w:type="spellStart"/>
+      <w:r>
+        <w:rPr>
+          <w:rFonts w:ascii="Courier New" w:eastAsia="Times New Roman" w:hAnsi="Courier New" w:cs="Courier New"/>
+          <w:kern w:val="0"/>
+          <w:sz w:val="20"/>
+          <w:szCs w:val="20"/>
+          <w:lang w:eastAsia="en-IN"/>
+          <w14:ligatures w14:val="none"/>
+        </w:rPr>
+        <w:t>tags.env</w:t>
+      </w:r>
+      <w:proofErr w:type="spellEnd"/>
       <w:r>
         <w:rPr>
           <w:rFonts w:ascii="Courier New" w:eastAsia="Times New Roman" w:hAnsi="Courier New" w:cs="Courier New"/>
@@ -1071,7 +1278,7 @@
           <w:lang w:eastAsia="en-IN"/>
           <w14:ligatures w14:val="none"/>
         </w:rPr>
-        <w:pict w14:anchorId="5B7E0EBF">
+        <w:pict w14:anchorId="583B9C30">
           <v:rect id="_x0000_i1028" style="width:0;height:1.5pt" o:hralign="center" o:hrstd="t" o:hr="t" fillcolor="#a0a0a0" stroked="f"/>
         </w:pict>
       </w:r>
@@ -1170,8 +1377,21 @@
           <w:lang w:eastAsia="en-IN"/>
           <w14:ligatures w14:val="none"/>
         </w:rPr>
-        <w:t>vim ansible.cfg</w:t>
-      </w:r>
+        <w:t xml:space="preserve">vim </w:t>
+      </w:r>
+      <w:proofErr w:type="spellStart"/>
+      <w:r>
+        <w:rPr>
+          <w:rFonts w:ascii="Courier New" w:eastAsia="Times New Roman" w:hAnsi="Courier New" w:cs="Courier New"/>
+          <w:kern w:val="0"/>
+          <w:sz w:val="20"/>
+          <w:szCs w:val="20"/>
+          <w:lang w:eastAsia="en-IN"/>
+          <w14:ligatures w14:val="none"/>
+        </w:rPr>
+        <w:t>ansible.cfg</w:t>
+      </w:r>
+      <w:proofErr w:type="spellEnd"/>
     </w:p>
     <w:p>
       <w:pPr>
@@ -1260,123 +1480,30 @@
           <w14:ligatures w14:val="none"/>
         </w:rPr>
         <w:br/>
-        <w:t>host_key_checking = False</w:t>
-      </w:r>
-      <w:r>
-        <w:rPr>
-          <w:rFonts w:ascii="Courier New" w:eastAsia="Times New Roman" w:hAnsi="Courier New" w:cs="Courier New"/>
-          <w:kern w:val="0"/>
-          <w:sz w:val="20"/>
-          <w:szCs w:val="20"/>
-          <w:lang w:eastAsia="en-IN"/>
-          <w14:ligatures w14:val="none"/>
-        </w:rPr>
-        <w:br/>
-      </w:r>
-      <w:r>
-        <w:rPr>
-          <w:rFonts w:ascii="Courier New" w:eastAsia="Times New Roman" w:hAnsi="Courier New" w:cs="Courier New"/>
-          <w:kern w:val="0"/>
-          <w:sz w:val="20"/>
-          <w:szCs w:val="20"/>
-          <w:lang w:eastAsia="en-IN"/>
-          <w14:ligatures w14:val="none"/>
-        </w:rPr>
-        <w:br/>
-        <w:t>[inventory]</w:t>
-      </w:r>
-      <w:r>
-        <w:rPr>
-          <w:rFonts w:ascii="Courier New" w:eastAsia="Times New Roman" w:hAnsi="Courier New" w:cs="Courier New"/>
-          <w:kern w:val="0"/>
-          <w:sz w:val="20"/>
-          <w:szCs w:val="20"/>
-          <w:lang w:eastAsia="en-IN"/>
-          <w14:ligatures w14:val="none"/>
-        </w:rPr>
-        <w:br/>
-        <w:t>enable_plugins = aws_ec2</w:t>
-      </w:r>
-    </w:p>
-    <w:p>
-      <w:pPr>
-        <w:spacing w:after="0" w:line="240" w:lineRule="auto"/>
-        <w:rPr>
-          <w:rFonts w:ascii="Times New Roman" w:eastAsia="Times New Roman" w:hAnsi="Times New Roman" w:cs="Times New Roman"/>
-          <w:kern w:val="0"/>
-          <w:sz w:val="24"/>
-          <w:szCs w:val="24"/>
-          <w:lang w:eastAsia="en-IN"/>
-          <w14:ligatures w14:val="none"/>
-        </w:rPr>
-      </w:pPr>
-      <w:r>
-        <w:rPr>
-          <w:rFonts w:ascii="Times New Roman" w:eastAsia="Times New Roman" w:hAnsi="Times New Roman" w:cs="Times New Roman"/>
-          <w:kern w:val="0"/>
-          <w:sz w:val="24"/>
-          <w:szCs w:val="24"/>
-          <w:lang w:eastAsia="en-IN"/>
-          <w14:ligatures w14:val="none"/>
-        </w:rPr>
-        <w:pict w14:anchorId="0E0897FF">
-          <v:rect id="_x0000_i1029" style="width:0;height:1.5pt" o:hralign="center" o:hrstd="t" o:hr="t" fillcolor="#a0a0a0" stroked="f"/>
-        </w:pict>
-      </w:r>
-    </w:p>
-    <w:p>
-      <w:pPr>
-        <w:spacing w:before="100" w:beforeAutospacing="1" w:after="100" w:afterAutospacing="1" w:line="240" w:lineRule="auto"/>
-        <w:outlineLvl w:val="0"/>
-        <w:rPr>
-          <w:rFonts w:ascii="Times New Roman" w:eastAsia="Times New Roman" w:hAnsi="Times New Roman" w:cs="Times New Roman"/>
-          <w:b/>
-          <w:bCs/>
-          <w:kern w:val="36"/>
-          <w:sz w:val="48"/>
-          <w:szCs w:val="48"/>
-          <w:lang w:eastAsia="en-IN"/>
-          <w14:ligatures w14:val="none"/>
-        </w:rPr>
-      </w:pPr>
-      <w:r>
-        <w:rPr>
-          <w:rFonts w:ascii="Times New Roman" w:eastAsia="Times New Roman" w:hAnsi="Times New Roman" w:cs="Times New Roman"/>
-          <w:b/>
-          <w:bCs/>
-          <w:kern w:val="36"/>
-          <w:sz w:val="48"/>
-          <w:szCs w:val="48"/>
-          <w:lang w:eastAsia="en-IN"/>
-          <w14:ligatures w14:val="none"/>
-        </w:rPr>
-        <w:t>6️</w:t>
-      </w:r>
-      <w:r>
-        <w:rPr>
-          <w:rFonts w:ascii="Segoe UI Symbol" w:eastAsia="Times New Roman" w:hAnsi="Segoe UI Symbol" w:cs="Segoe UI Symbol"/>
-          <w:b/>
-          <w:bCs/>
-          <w:kern w:val="36"/>
-          <w:sz w:val="48"/>
-          <w:szCs w:val="48"/>
-          <w:lang w:eastAsia="en-IN"/>
-          <w14:ligatures w14:val="none"/>
-        </w:rPr>
-        <w:t>⃣</w:t>
-      </w:r>
-      <w:r>
-        <w:rPr>
-          <w:rFonts w:ascii="Times New Roman" w:eastAsia="Times New Roman" w:hAnsi="Times New Roman" w:cs="Times New Roman"/>
-          <w:b/>
-          <w:bCs/>
-          <w:kern w:val="36"/>
-          <w:sz w:val="48"/>
-          <w:szCs w:val="48"/>
-          <w:lang w:eastAsia="en-IN"/>
-          <w14:ligatures w14:val="none"/>
-        </w:rPr>
-        <w:t xml:space="preserve"> Test dynamic inventory</w:t>
+      </w:r>
+      <w:proofErr w:type="spellStart"/>
+      <w:r>
+        <w:rPr>
+          <w:rFonts w:ascii="Courier New" w:eastAsia="Times New Roman" w:hAnsi="Courier New" w:cs="Courier New"/>
+          <w:kern w:val="0"/>
+          <w:sz w:val="20"/>
+          <w:szCs w:val="20"/>
+          <w:lang w:eastAsia="en-IN"/>
+          <w14:ligatures w14:val="none"/>
+        </w:rPr>
+        <w:t>host_key_checking</w:t>
+      </w:r>
+      <w:proofErr w:type="spellEnd"/>
+      <w:r>
+        <w:rPr>
+          <w:rFonts w:ascii="Courier New" w:eastAsia="Times New Roman" w:hAnsi="Courier New" w:cs="Courier New"/>
+          <w:kern w:val="0"/>
+          <w:sz w:val="20"/>
+          <w:szCs w:val="20"/>
+          <w:lang w:eastAsia="en-IN"/>
+          <w14:ligatures w14:val="none"/>
+        </w:rPr>
+        <w:t xml:space="preserve"> = False</w:t>
       </w:r>
     </w:p>
     <w:p>
@@ -1409,40 +1536,216 @@
           <w14:ligatures w14:val="none"/>
         </w:rPr>
       </w:pPr>
-      <w:r>
-        <w:rPr>
-          <w:rFonts w:ascii="Courier New" w:eastAsia="Times New Roman" w:hAnsi="Courier New" w:cs="Courier New"/>
-          <w:kern w:val="0"/>
-          <w:sz w:val="20"/>
-          <w:szCs w:val="20"/>
-          <w:lang w:eastAsia="en-IN"/>
-          <w14:ligatures w14:val="none"/>
-        </w:rPr>
-        <w:t>ansible-inventory -i aws_ec2.yml --graph</w:t>
+      <w:proofErr w:type="spellStart"/>
+      <w:r>
+        <w:rPr>
+          <w:rFonts w:ascii="Courier New" w:eastAsia="Times New Roman" w:hAnsi="Courier New" w:cs="Courier New"/>
+          <w:kern w:val="0"/>
+          <w:sz w:val="20"/>
+          <w:szCs w:val="20"/>
+          <w:lang w:eastAsia="en-IN"/>
+          <w14:ligatures w14:val="none"/>
+        </w:rPr>
+        <w:t>remote_user</w:t>
+      </w:r>
+      <w:proofErr w:type="spellEnd"/>
+      <w:r>
+        <w:rPr>
+          <w:rFonts w:ascii="Courier New" w:eastAsia="Times New Roman" w:hAnsi="Courier New" w:cs="Courier New"/>
+          <w:kern w:val="0"/>
+          <w:sz w:val="20"/>
+          <w:szCs w:val="20"/>
+          <w:lang w:eastAsia="en-IN"/>
+          <w14:ligatures w14:val="none"/>
+        </w:rPr>
+        <w:t xml:space="preserve"> = ubuntu</w:t>
+      </w:r>
+      <w:r>
+        <w:rPr>
+          <w:rFonts w:ascii="Courier New" w:eastAsia="Times New Roman" w:hAnsi="Courier New" w:cs="Courier New"/>
+          <w:kern w:val="0"/>
+          <w:sz w:val="20"/>
+          <w:szCs w:val="20"/>
+          <w:lang w:eastAsia="en-IN"/>
+          <w14:ligatures w14:val="none"/>
+        </w:rPr>
+        <w:br/>
+      </w:r>
+      <w:proofErr w:type="spellStart"/>
+      <w:r>
+        <w:rPr>
+          <w:rFonts w:ascii="Courier New" w:eastAsia="Times New Roman" w:hAnsi="Courier New" w:cs="Courier New"/>
+          <w:kern w:val="0"/>
+          <w:sz w:val="20"/>
+          <w:szCs w:val="20"/>
+          <w:lang w:eastAsia="en-IN"/>
+          <w14:ligatures w14:val="none"/>
+        </w:rPr>
+        <w:t>private_key_file</w:t>
+      </w:r>
+      <w:proofErr w:type="spellEnd"/>
+      <w:r>
+        <w:rPr>
+          <w:rFonts w:ascii="Courier New" w:eastAsia="Times New Roman" w:hAnsi="Courier New" w:cs="Courier New"/>
+          <w:kern w:val="0"/>
+          <w:sz w:val="20"/>
+          <w:szCs w:val="20"/>
+          <w:lang w:eastAsia="en-IN"/>
+          <w14:ligatures w14:val="none"/>
+        </w:rPr>
+        <w:t xml:space="preserve"> = ~/keys/</w:t>
+      </w:r>
+      <w:proofErr w:type="spellStart"/>
+      <w:r>
+        <w:rPr>
+          <w:rFonts w:ascii="Courier New" w:eastAsia="Times New Roman" w:hAnsi="Courier New" w:cs="Courier New"/>
+          <w:kern w:val="0"/>
+          <w:sz w:val="20"/>
+          <w:szCs w:val="20"/>
+          <w:lang w:eastAsia="en-IN"/>
+          <w14:ligatures w14:val="none"/>
+        </w:rPr>
+        <w:t>mykey.pem</w:t>
+      </w:r>
+      <w:proofErr w:type="spellEnd"/>
+      <w:r>
+        <w:rPr>
+          <w:rFonts w:ascii="Courier New" w:eastAsia="Times New Roman" w:hAnsi="Courier New" w:cs="Courier New"/>
+          <w:kern w:val="0"/>
+          <w:sz w:val="20"/>
+          <w:szCs w:val="20"/>
+          <w:lang w:eastAsia="en-IN"/>
+          <w14:ligatures w14:val="none"/>
+        </w:rPr>
+        <w:br/>
+      </w:r>
+      <w:r>
+        <w:rPr>
+          <w:rFonts w:ascii="Courier New" w:eastAsia="Times New Roman" w:hAnsi="Courier New" w:cs="Courier New"/>
+          <w:kern w:val="0"/>
+          <w:sz w:val="20"/>
+          <w:szCs w:val="20"/>
+          <w:lang w:eastAsia="en-IN"/>
+          <w14:ligatures w14:val="none"/>
+        </w:rPr>
+        <w:br/>
+        <w:t>[inventory]</w:t>
+      </w:r>
+      <w:r>
+        <w:rPr>
+          <w:rFonts w:ascii="Courier New" w:eastAsia="Times New Roman" w:hAnsi="Courier New" w:cs="Courier New"/>
+          <w:kern w:val="0"/>
+          <w:sz w:val="20"/>
+          <w:szCs w:val="20"/>
+          <w:lang w:eastAsia="en-IN"/>
+          <w14:ligatures w14:val="none"/>
+        </w:rPr>
+        <w:br/>
+      </w:r>
+      <w:proofErr w:type="spellStart"/>
+      <w:r>
+        <w:rPr>
+          <w:rFonts w:ascii="Courier New" w:eastAsia="Times New Roman" w:hAnsi="Courier New" w:cs="Courier New"/>
+          <w:kern w:val="0"/>
+          <w:sz w:val="20"/>
+          <w:szCs w:val="20"/>
+          <w:lang w:eastAsia="en-IN"/>
+          <w14:ligatures w14:val="none"/>
+        </w:rPr>
+        <w:t>enable_plugins</w:t>
+      </w:r>
+      <w:proofErr w:type="spellEnd"/>
+      <w:r>
+        <w:rPr>
+          <w:rFonts w:ascii="Courier New" w:eastAsia="Times New Roman" w:hAnsi="Courier New" w:cs="Courier New"/>
+          <w:kern w:val="0"/>
+          <w:sz w:val="20"/>
+          <w:szCs w:val="20"/>
+          <w:lang w:eastAsia="en-IN"/>
+          <w14:ligatures w14:val="none"/>
+        </w:rPr>
+        <w:t xml:space="preserve"> = aws_ec2</w:t>
+      </w:r>
+    </w:p>
+    <w:p>
+      <w:pPr>
+        <w:spacing w:after="0" w:line="240" w:lineRule="auto"/>
+        <w:rPr>
+          <w:rFonts w:ascii="Times New Roman" w:eastAsia="Times New Roman" w:hAnsi="Times New Roman" w:cs="Times New Roman"/>
+          <w:kern w:val="0"/>
+          <w:sz w:val="24"/>
+          <w:szCs w:val="24"/>
+          <w:lang w:eastAsia="en-IN"/>
+          <w14:ligatures w14:val="none"/>
+        </w:rPr>
+      </w:pPr>
+      <w:r>
+        <w:rPr>
+          <w:rFonts w:ascii="Times New Roman" w:eastAsia="Times New Roman" w:hAnsi="Times New Roman" w:cs="Times New Roman"/>
+          <w:kern w:val="0"/>
+          <w:sz w:val="24"/>
+          <w:szCs w:val="24"/>
+          <w:lang w:eastAsia="en-IN"/>
+          <w14:ligatures w14:val="none"/>
+        </w:rPr>
+        <w:pict w14:anchorId="583B9C31">
+          <v:rect id="_x0000_i1029" style="width:0;height:1.5pt" o:hralign="center" o:hrstd="t" o:hr="t" fillcolor="#a0a0a0" stroked="f"/>
+        </w:pict>
       </w:r>
     </w:p>
     <w:p>
       <w:pPr>
         <w:spacing w:before="100" w:beforeAutospacing="1" w:after="100" w:afterAutospacing="1" w:line="240" w:lineRule="auto"/>
-        <w:rPr>
-          <w:rFonts w:ascii="Times New Roman" w:eastAsia="Times New Roman" w:hAnsi="Times New Roman" w:cs="Times New Roman"/>
-          <w:kern w:val="0"/>
-          <w:sz w:val="24"/>
-          <w:szCs w:val="24"/>
-          <w:lang w:eastAsia="en-IN"/>
-          <w14:ligatures w14:val="none"/>
-        </w:rPr>
-      </w:pPr>
-      <w:r>
-        <w:rPr>
-          <w:rFonts w:ascii="Times New Roman" w:eastAsia="Times New Roman" w:hAnsi="Times New Roman" w:cs="Times New Roman"/>
-          <w:kern w:val="0"/>
-          <w:sz w:val="24"/>
-          <w:szCs w:val="24"/>
-          <w:lang w:eastAsia="en-IN"/>
-          <w14:ligatures w14:val="none"/>
-        </w:rPr>
-        <w:t>Example output:</w:t>
+        <w:outlineLvl w:val="0"/>
+        <w:rPr>
+          <w:rFonts w:ascii="Times New Roman" w:eastAsia="Times New Roman" w:hAnsi="Times New Roman" w:cs="Times New Roman"/>
+          <w:b/>
+          <w:bCs/>
+          <w:kern w:val="36"/>
+          <w:sz w:val="48"/>
+          <w:szCs w:val="48"/>
+          <w:lang w:eastAsia="en-IN"/>
+          <w14:ligatures w14:val="none"/>
+        </w:rPr>
+      </w:pPr>
+      <w:r>
+        <w:rPr>
+          <w:rFonts w:ascii="Times New Roman" w:eastAsia="Times New Roman" w:hAnsi="Times New Roman" w:cs="Times New Roman"/>
+          <w:b/>
+          <w:bCs/>
+          <w:kern w:val="36"/>
+          <w:sz w:val="48"/>
+          <w:szCs w:val="48"/>
+          <w:lang w:eastAsia="en-IN"/>
+          <w14:ligatures w14:val="none"/>
+        </w:rPr>
+        <w:t>6️</w:t>
+      </w:r>
+      <w:r>
+        <w:rPr>
+          <w:rFonts w:ascii="Segoe UI Symbol" w:eastAsia="Times New Roman" w:hAnsi="Segoe UI Symbol" w:cs="Segoe UI Symbol"/>
+          <w:b/>
+          <w:bCs/>
+          <w:kern w:val="36"/>
+          <w:sz w:val="48"/>
+          <w:szCs w:val="48"/>
+          <w:lang w:eastAsia="en-IN"/>
+          <w14:ligatures w14:val="none"/>
+        </w:rPr>
+        <w:t>⃣</w:t>
+      </w:r>
+      <w:r>
+        <w:rPr>
+          <w:rFonts w:ascii="Times New Roman" w:eastAsia="Times New Roman" w:hAnsi="Times New Roman" w:cs="Times New Roman"/>
+          <w:b/>
+          <w:bCs/>
+          <w:kern w:val="36"/>
+          <w:sz w:val="48"/>
+          <w:szCs w:val="48"/>
+          <w:lang w:eastAsia="en-IN"/>
+          <w14:ligatures w14:val="none"/>
+        </w:rPr>
+        <w:t xml:space="preserve"> Test dynamic inventory</w:t>
       </w:r>
     </w:p>
     <w:p>
@@ -1484,148 +1787,55 @@
           <w:lang w:eastAsia="en-IN"/>
           <w14:ligatures w14:val="none"/>
         </w:rPr>
-        <w:t>@all</w:t>
-      </w:r>
-      <w:r>
-        <w:rPr>
-          <w:rFonts w:ascii="Courier New" w:eastAsia="Times New Roman" w:hAnsi="Courier New" w:cs="Courier New"/>
-          <w:kern w:val="0"/>
-          <w:sz w:val="20"/>
-          <w:szCs w:val="20"/>
-          <w:lang w:eastAsia="en-IN"/>
-          <w14:ligatures w14:val="none"/>
-        </w:rPr>
-        <w:br/>
-        <w:t xml:space="preserve"> |--@aws_ec2</w:t>
-      </w:r>
-      <w:r>
-        <w:rPr>
-          <w:rFonts w:ascii="Courier New" w:eastAsia="Times New Roman" w:hAnsi="Courier New" w:cs="Courier New"/>
-          <w:kern w:val="0"/>
-          <w:sz w:val="20"/>
-          <w:szCs w:val="20"/>
-          <w:lang w:eastAsia="en-IN"/>
-          <w14:ligatures w14:val="none"/>
-        </w:rPr>
-        <w:br/>
-        <w:t xml:space="preserve"> |  |--10.0.1.12</w:t>
-      </w:r>
-      <w:r>
-        <w:rPr>
-          <w:rFonts w:ascii="Courier New" w:eastAsia="Times New Roman" w:hAnsi="Courier New" w:cs="Courier New"/>
-          <w:kern w:val="0"/>
-          <w:sz w:val="20"/>
-          <w:szCs w:val="20"/>
-          <w:lang w:eastAsia="en-IN"/>
-          <w14:ligatures w14:val="none"/>
-        </w:rPr>
-        <w:br/>
-        <w:t xml:space="preserve"> |  |--10.0.1.18</w:t>
-      </w:r>
-      <w:r>
-        <w:rPr>
-          <w:rFonts w:ascii="Courier New" w:eastAsia="Times New Roman" w:hAnsi="Courier New" w:cs="Courier New"/>
-          <w:kern w:val="0"/>
-          <w:sz w:val="20"/>
-          <w:szCs w:val="20"/>
-          <w:lang w:eastAsia="en-IN"/>
-          <w14:ligatures w14:val="none"/>
-        </w:rPr>
-        <w:br/>
-        <w:t xml:space="preserve"> |--@env_ansible_slave</w:t>
-      </w:r>
-      <w:r>
-        <w:rPr>
-          <w:rFonts w:ascii="Courier New" w:eastAsia="Times New Roman" w:hAnsi="Courier New" w:cs="Courier New"/>
-          <w:kern w:val="0"/>
-          <w:sz w:val="20"/>
-          <w:szCs w:val="20"/>
-          <w:lang w:eastAsia="en-IN"/>
-          <w14:ligatures w14:val="none"/>
-        </w:rPr>
-        <w:br/>
-        <w:t xml:space="preserve"> |  |--10.0.1.18</w:t>
-      </w:r>
-    </w:p>
-    <w:p>
-      <w:pPr>
-        <w:spacing w:after="0" w:line="240" w:lineRule="auto"/>
-        <w:rPr>
-          <w:rFonts w:ascii="Times New Roman" w:eastAsia="Times New Roman" w:hAnsi="Times New Roman" w:cs="Times New Roman"/>
-          <w:kern w:val="0"/>
-          <w:sz w:val="24"/>
-          <w:szCs w:val="24"/>
-          <w:lang w:eastAsia="en-IN"/>
-          <w14:ligatures w14:val="none"/>
-        </w:rPr>
-      </w:pPr>
-      <w:r>
-        <w:rPr>
-          <w:rFonts w:ascii="Times New Roman" w:eastAsia="Times New Roman" w:hAnsi="Times New Roman" w:cs="Times New Roman"/>
-          <w:kern w:val="0"/>
-          <w:sz w:val="24"/>
-          <w:szCs w:val="24"/>
-          <w:lang w:eastAsia="en-IN"/>
-          <w14:ligatures w14:val="none"/>
-        </w:rPr>
-        <w:pict w14:anchorId="7ABBC69C">
-          <v:rect id="_x0000_i1030" style="width:0;height:1.5pt" o:hralign="center" o:hrstd="t" o:hr="t" fillcolor="#a0a0a0" stroked="f"/>
-        </w:pict>
+        <w:t>ansible-inventory -</w:t>
+      </w:r>
+      <w:proofErr w:type="spellStart"/>
+      <w:r>
+        <w:rPr>
+          <w:rFonts w:ascii="Courier New" w:eastAsia="Times New Roman" w:hAnsi="Courier New" w:cs="Courier New"/>
+          <w:kern w:val="0"/>
+          <w:sz w:val="20"/>
+          <w:szCs w:val="20"/>
+          <w:lang w:eastAsia="en-IN"/>
+          <w14:ligatures w14:val="none"/>
+        </w:rPr>
+        <w:t>i</w:t>
+      </w:r>
+      <w:proofErr w:type="spellEnd"/>
+      <w:r>
+        <w:rPr>
+          <w:rFonts w:ascii="Courier New" w:eastAsia="Times New Roman" w:hAnsi="Courier New" w:cs="Courier New"/>
+          <w:kern w:val="0"/>
+          <w:sz w:val="20"/>
+          <w:szCs w:val="20"/>
+          <w:lang w:eastAsia="en-IN"/>
+          <w14:ligatures w14:val="none"/>
+        </w:rPr>
+        <w:t xml:space="preserve"> aws_ec2.yml --graph</w:t>
       </w:r>
     </w:p>
     <w:p>
       <w:pPr>
         <w:spacing w:before="100" w:beforeAutospacing="1" w:after="100" w:afterAutospacing="1" w:line="240" w:lineRule="auto"/>
-        <w:outlineLvl w:val="0"/>
-        <w:rPr>
-          <w:rFonts w:ascii="Times New Roman" w:eastAsia="Times New Roman" w:hAnsi="Times New Roman" w:cs="Times New Roman"/>
-          <w:b/>
-          <w:bCs/>
-          <w:kern w:val="36"/>
-          <w:sz w:val="48"/>
-          <w:szCs w:val="48"/>
-          <w:lang w:eastAsia="en-IN"/>
-          <w14:ligatures w14:val="none"/>
-        </w:rPr>
-      </w:pPr>
-      <w:r>
-        <w:rPr>
-          <w:rFonts w:ascii="Times New Roman" w:eastAsia="Times New Roman" w:hAnsi="Times New Roman" w:cs="Times New Roman"/>
-          <w:b/>
-          <w:bCs/>
-          <w:kern w:val="36"/>
-          <w:sz w:val="48"/>
-          <w:szCs w:val="48"/>
-          <w:lang w:eastAsia="en-IN"/>
-          <w14:ligatures w14:val="none"/>
-        </w:rPr>
-        <w:t>7️</w:t>
-      </w:r>
-      <w:r>
-        <w:rPr>
-          <w:rFonts w:ascii="Segoe UI Symbol" w:eastAsia="Times New Roman" w:hAnsi="Segoe UI Symbol" w:cs="Segoe UI Symbol"/>
-          <w:b/>
-          <w:bCs/>
-          <w:kern w:val="36"/>
-          <w:sz w:val="48"/>
-          <w:szCs w:val="48"/>
-          <w:lang w:eastAsia="en-IN"/>
-          <w14:ligatures w14:val="none"/>
-        </w:rPr>
-        <w:t>⃣</w:t>
-      </w:r>
-      <w:r>
-        <w:rPr>
-          <w:rFonts w:ascii="Times New Roman" w:eastAsia="Times New Roman" w:hAnsi="Times New Roman" w:cs="Times New Roman"/>
-          <w:b/>
-          <w:bCs/>
-          <w:kern w:val="36"/>
-          <w:sz w:val="48"/>
-          <w:szCs w:val="48"/>
-          <w:lang w:eastAsia="en-IN"/>
-          <w14:ligatures w14:val="none"/>
-        </w:rPr>
-        <w:t xml:space="preserve"> Test connectivity</w:t>
+        <w:rPr>
+          <w:rFonts w:ascii="Times New Roman" w:eastAsia="Times New Roman" w:hAnsi="Times New Roman" w:cs="Times New Roman"/>
+          <w:kern w:val="0"/>
+          <w:sz w:val="24"/>
+          <w:szCs w:val="24"/>
+          <w:lang w:eastAsia="en-IN"/>
+          <w14:ligatures w14:val="none"/>
+        </w:rPr>
+      </w:pPr>
+      <w:r>
+        <w:rPr>
+          <w:rFonts w:ascii="Times New Roman" w:eastAsia="Times New Roman" w:hAnsi="Times New Roman" w:cs="Times New Roman"/>
+          <w:kern w:val="0"/>
+          <w:sz w:val="24"/>
+          <w:szCs w:val="24"/>
+          <w:lang w:eastAsia="en-IN"/>
+          <w14:ligatures w14:val="none"/>
+        </w:rPr>
+        <w:t>Example output:</w:t>
       </w:r>
     </w:p>
     <w:p>
@@ -1667,31 +1877,220 @@
           <w:lang w:eastAsia="en-IN"/>
           <w14:ligatures w14:val="none"/>
         </w:rPr>
-        <w:t>ansible all -i aws_ec2.yml -m ping -u ubuntu --private-key ~/keys/mykey.pem</w:t>
+        <w:t>@all</w:t>
+      </w:r>
+      <w:r>
+        <w:rPr>
+          <w:rFonts w:ascii="Courier New" w:eastAsia="Times New Roman" w:hAnsi="Courier New" w:cs="Courier New"/>
+          <w:kern w:val="0"/>
+          <w:sz w:val="20"/>
+          <w:szCs w:val="20"/>
+          <w:lang w:eastAsia="en-IN"/>
+          <w14:ligatures w14:val="none"/>
+        </w:rPr>
+        <w:br/>
+        <w:t xml:space="preserve"> |--@aws_ec2</w:t>
+      </w:r>
+      <w:r>
+        <w:rPr>
+          <w:rFonts w:ascii="Courier New" w:eastAsia="Times New Roman" w:hAnsi="Courier New" w:cs="Courier New"/>
+          <w:kern w:val="0"/>
+          <w:sz w:val="20"/>
+          <w:szCs w:val="20"/>
+          <w:lang w:eastAsia="en-IN"/>
+          <w14:ligatures w14:val="none"/>
+        </w:rPr>
+        <w:br/>
+        <w:t xml:space="preserve"> </w:t>
+      </w:r>
+      <w:proofErr w:type="gramStart"/>
+      <w:r>
+        <w:rPr>
+          <w:rFonts w:ascii="Courier New" w:eastAsia="Times New Roman" w:hAnsi="Courier New" w:cs="Courier New"/>
+          <w:kern w:val="0"/>
+          <w:sz w:val="20"/>
+          <w:szCs w:val="20"/>
+          <w:lang w:eastAsia="en-IN"/>
+          <w14:ligatures w14:val="none"/>
+        </w:rPr>
+        <w:t>|  |</w:t>
+      </w:r>
+      <w:proofErr w:type="gramEnd"/>
+      <w:r>
+        <w:rPr>
+          <w:rFonts w:ascii="Courier New" w:eastAsia="Times New Roman" w:hAnsi="Courier New" w:cs="Courier New"/>
+          <w:kern w:val="0"/>
+          <w:sz w:val="20"/>
+          <w:szCs w:val="20"/>
+          <w:lang w:eastAsia="en-IN"/>
+          <w14:ligatures w14:val="none"/>
+        </w:rPr>
+        <w:t>--10.0.1.12</w:t>
+      </w:r>
+      <w:r>
+        <w:rPr>
+          <w:rFonts w:ascii="Courier New" w:eastAsia="Times New Roman" w:hAnsi="Courier New" w:cs="Courier New"/>
+          <w:kern w:val="0"/>
+          <w:sz w:val="20"/>
+          <w:szCs w:val="20"/>
+          <w:lang w:eastAsia="en-IN"/>
+          <w14:ligatures w14:val="none"/>
+        </w:rPr>
+        <w:br/>
+        <w:t xml:space="preserve"> </w:t>
+      </w:r>
+      <w:proofErr w:type="gramStart"/>
+      <w:r>
+        <w:rPr>
+          <w:rFonts w:ascii="Courier New" w:eastAsia="Times New Roman" w:hAnsi="Courier New" w:cs="Courier New"/>
+          <w:kern w:val="0"/>
+          <w:sz w:val="20"/>
+          <w:szCs w:val="20"/>
+          <w:lang w:eastAsia="en-IN"/>
+          <w14:ligatures w14:val="none"/>
+        </w:rPr>
+        <w:t>|  |</w:t>
+      </w:r>
+      <w:proofErr w:type="gramEnd"/>
+      <w:r>
+        <w:rPr>
+          <w:rFonts w:ascii="Courier New" w:eastAsia="Times New Roman" w:hAnsi="Courier New" w:cs="Courier New"/>
+          <w:kern w:val="0"/>
+          <w:sz w:val="20"/>
+          <w:szCs w:val="20"/>
+          <w:lang w:eastAsia="en-IN"/>
+          <w14:ligatures w14:val="none"/>
+        </w:rPr>
+        <w:t>--10.0.1.18</w:t>
+      </w:r>
+      <w:r>
+        <w:rPr>
+          <w:rFonts w:ascii="Courier New" w:eastAsia="Times New Roman" w:hAnsi="Courier New" w:cs="Courier New"/>
+          <w:kern w:val="0"/>
+          <w:sz w:val="20"/>
+          <w:szCs w:val="20"/>
+          <w:lang w:eastAsia="en-IN"/>
+          <w14:ligatures w14:val="none"/>
+        </w:rPr>
+        <w:br/>
+        <w:t xml:space="preserve"> |--@env_ansible_slave</w:t>
+      </w:r>
+      <w:r>
+        <w:rPr>
+          <w:rFonts w:ascii="Courier New" w:eastAsia="Times New Roman" w:hAnsi="Courier New" w:cs="Courier New"/>
+          <w:kern w:val="0"/>
+          <w:sz w:val="20"/>
+          <w:szCs w:val="20"/>
+          <w:lang w:eastAsia="en-IN"/>
+          <w14:ligatures w14:val="none"/>
+        </w:rPr>
+        <w:br/>
+        <w:t xml:space="preserve"> </w:t>
+      </w:r>
+      <w:proofErr w:type="gramStart"/>
+      <w:r>
+        <w:rPr>
+          <w:rFonts w:ascii="Courier New" w:eastAsia="Times New Roman" w:hAnsi="Courier New" w:cs="Courier New"/>
+          <w:kern w:val="0"/>
+          <w:sz w:val="20"/>
+          <w:szCs w:val="20"/>
+          <w:lang w:eastAsia="en-IN"/>
+          <w14:ligatures w14:val="none"/>
+        </w:rPr>
+        <w:t>|  |</w:t>
+      </w:r>
+      <w:proofErr w:type="gramEnd"/>
+      <w:r>
+        <w:rPr>
+          <w:rFonts w:ascii="Courier New" w:eastAsia="Times New Roman" w:hAnsi="Courier New" w:cs="Courier New"/>
+          <w:kern w:val="0"/>
+          <w:sz w:val="20"/>
+          <w:szCs w:val="20"/>
+          <w:lang w:eastAsia="en-IN"/>
+          <w14:ligatures w14:val="none"/>
+        </w:rPr>
+        <w:t>--10.0.1.18</w:t>
+      </w:r>
+    </w:p>
+    <w:p>
+      <w:pPr>
+        <w:spacing w:after="0" w:line="240" w:lineRule="auto"/>
+        <w:rPr>
+          <w:rFonts w:ascii="Times New Roman" w:eastAsia="Times New Roman" w:hAnsi="Times New Roman" w:cs="Times New Roman"/>
+          <w:kern w:val="0"/>
+          <w:sz w:val="24"/>
+          <w:szCs w:val="24"/>
+          <w:lang w:eastAsia="en-IN"/>
+          <w14:ligatures w14:val="none"/>
+        </w:rPr>
+      </w:pPr>
+      <w:r>
+        <w:rPr>
+          <w:rFonts w:ascii="Times New Roman" w:eastAsia="Times New Roman" w:hAnsi="Times New Roman" w:cs="Times New Roman"/>
+          <w:kern w:val="0"/>
+          <w:sz w:val="24"/>
+          <w:szCs w:val="24"/>
+          <w:lang w:eastAsia="en-IN"/>
+          <w14:ligatures w14:val="none"/>
+        </w:rPr>
+        <w:pict w14:anchorId="583B9C32">
+          <v:rect id="_x0000_i1030" style="width:0;height:1.5pt" o:hralign="center" o:hrstd="t" o:hr="t" fillcolor="#a0a0a0" stroked="f"/>
+        </w:pict>
       </w:r>
     </w:p>
     <w:p>
       <w:pPr>
         <w:spacing w:before="100" w:beforeAutospacing="1" w:after="100" w:afterAutospacing="1" w:line="240" w:lineRule="auto"/>
-        <w:rPr>
-          <w:rFonts w:ascii="Times New Roman" w:eastAsia="Times New Roman" w:hAnsi="Times New Roman" w:cs="Times New Roman"/>
-          <w:kern w:val="0"/>
-          <w:sz w:val="24"/>
-          <w:szCs w:val="24"/>
-          <w:lang w:eastAsia="en-IN"/>
-          <w14:ligatures w14:val="none"/>
-        </w:rPr>
-      </w:pPr>
-      <w:r>
-        <w:rPr>
-          <w:rFonts w:ascii="Times New Roman" w:eastAsia="Times New Roman" w:hAnsi="Times New Roman" w:cs="Times New Roman"/>
-          <w:kern w:val="0"/>
-          <w:sz w:val="24"/>
-          <w:szCs w:val="24"/>
-          <w:lang w:eastAsia="en-IN"/>
-          <w14:ligatures w14:val="none"/>
-        </w:rPr>
-        <w:t>Expected:</w:t>
+        <w:outlineLvl w:val="0"/>
+        <w:rPr>
+          <w:rFonts w:ascii="Times New Roman" w:eastAsia="Times New Roman" w:hAnsi="Times New Roman" w:cs="Times New Roman"/>
+          <w:b/>
+          <w:bCs/>
+          <w:kern w:val="36"/>
+          <w:sz w:val="48"/>
+          <w:szCs w:val="48"/>
+          <w:lang w:eastAsia="en-IN"/>
+          <w14:ligatures w14:val="none"/>
+        </w:rPr>
+      </w:pPr>
+      <w:r>
+        <w:rPr>
+          <w:rFonts w:ascii="Times New Roman" w:eastAsia="Times New Roman" w:hAnsi="Times New Roman" w:cs="Times New Roman"/>
+          <w:b/>
+          <w:bCs/>
+          <w:kern w:val="36"/>
+          <w:sz w:val="48"/>
+          <w:szCs w:val="48"/>
+          <w:lang w:eastAsia="en-IN"/>
+          <w14:ligatures w14:val="none"/>
+        </w:rPr>
+        <w:t>7️</w:t>
+      </w:r>
+      <w:r>
+        <w:rPr>
+          <w:rFonts w:ascii="Segoe UI Symbol" w:eastAsia="Times New Roman" w:hAnsi="Segoe UI Symbol" w:cs="Segoe UI Symbol"/>
+          <w:b/>
+          <w:bCs/>
+          <w:kern w:val="36"/>
+          <w:sz w:val="48"/>
+          <w:szCs w:val="48"/>
+          <w:lang w:eastAsia="en-IN"/>
+          <w14:ligatures w14:val="none"/>
+        </w:rPr>
+        <w:t>⃣</w:t>
+      </w:r>
+      <w:r>
+        <w:rPr>
+          <w:rFonts w:ascii="Times New Roman" w:eastAsia="Times New Roman" w:hAnsi="Times New Roman" w:cs="Times New Roman"/>
+          <w:b/>
+          <w:bCs/>
+          <w:kern w:val="36"/>
+          <w:sz w:val="48"/>
+          <w:szCs w:val="48"/>
+          <w:lang w:eastAsia="en-IN"/>
+          <w14:ligatures w14:val="none"/>
+        </w:rPr>
+        <w:t xml:space="preserve"> Test connectivity</w:t>
       </w:r>
     </w:p>
     <w:p>
@@ -1733,137 +2132,55 @@
           <w:lang w:eastAsia="en-IN"/>
           <w14:ligatures w14:val="none"/>
         </w:rPr>
-        <w:lastRenderedPageBreak/>
-        <w:t>10.0.1.18 | SUCCESS =&gt; {</w:t>
-      </w:r>
-      <w:r>
-        <w:rPr>
-          <w:rFonts w:ascii="Courier New" w:eastAsia="Times New Roman" w:hAnsi="Courier New" w:cs="Courier New"/>
-          <w:kern w:val="0"/>
-          <w:sz w:val="20"/>
-          <w:szCs w:val="20"/>
-          <w:lang w:eastAsia="en-IN"/>
-          <w14:ligatures w14:val="none"/>
-        </w:rPr>
-        <w:br/>
-        <w:t xml:space="preserve">    "ping": "pong"</w:t>
-      </w:r>
-      <w:r>
-        <w:rPr>
-          <w:rFonts w:ascii="Courier New" w:eastAsia="Times New Roman" w:hAnsi="Courier New" w:cs="Courier New"/>
-          <w:kern w:val="0"/>
-          <w:sz w:val="20"/>
-          <w:szCs w:val="20"/>
-          <w:lang w:eastAsia="en-IN"/>
-          <w14:ligatures w14:val="none"/>
-        </w:rPr>
-        <w:br/>
-        <w:t>}</w:t>
-      </w:r>
-    </w:p>
-    <w:p>
-      <w:pPr>
-        <w:spacing w:after="0" w:line="240" w:lineRule="auto"/>
-        <w:rPr>
-          <w:rFonts w:ascii="Times New Roman" w:eastAsia="Times New Roman" w:hAnsi="Times New Roman" w:cs="Times New Roman"/>
-          <w:kern w:val="0"/>
-          <w:sz w:val="24"/>
-          <w:szCs w:val="24"/>
-          <w:lang w:eastAsia="en-IN"/>
-          <w14:ligatures w14:val="none"/>
-        </w:rPr>
-      </w:pPr>
-      <w:r>
-        <w:rPr>
-          <w:rFonts w:ascii="Times New Roman" w:eastAsia="Times New Roman" w:hAnsi="Times New Roman" w:cs="Times New Roman"/>
-          <w:kern w:val="0"/>
-          <w:sz w:val="24"/>
-          <w:szCs w:val="24"/>
-          <w:lang w:eastAsia="en-IN"/>
-          <w14:ligatures w14:val="none"/>
-        </w:rPr>
-        <w:pict w14:anchorId="10BF38A0">
-          <v:rect id="_x0000_i1031" style="width:0;height:1.5pt" o:hralign="center" o:hrstd="t" o:hr="t" fillcolor="#a0a0a0" stroked="f"/>
-        </w:pict>
+        <w:t>ansible all -</w:t>
+      </w:r>
+      <w:proofErr w:type="spellStart"/>
+      <w:r>
+        <w:rPr>
+          <w:rFonts w:ascii="Courier New" w:eastAsia="Times New Roman" w:hAnsi="Courier New" w:cs="Courier New"/>
+          <w:kern w:val="0"/>
+          <w:sz w:val="20"/>
+          <w:szCs w:val="20"/>
+          <w:lang w:eastAsia="en-IN"/>
+          <w14:ligatures w14:val="none"/>
+        </w:rPr>
+        <w:t>i</w:t>
+      </w:r>
+      <w:proofErr w:type="spellEnd"/>
+      <w:r>
+        <w:rPr>
+          <w:rFonts w:ascii="Courier New" w:eastAsia="Times New Roman" w:hAnsi="Courier New" w:cs="Courier New"/>
+          <w:kern w:val="0"/>
+          <w:sz w:val="20"/>
+          <w:szCs w:val="20"/>
+          <w:lang w:eastAsia="en-IN"/>
+          <w14:ligatures w14:val="none"/>
+        </w:rPr>
+        <w:t xml:space="preserve"> aws_ec2.yml -m ping </w:t>
       </w:r>
     </w:p>
     <w:p>
       <w:pPr>
         <w:spacing w:before="100" w:beforeAutospacing="1" w:after="100" w:afterAutospacing="1" w:line="240" w:lineRule="auto"/>
-        <w:outlineLvl w:val="0"/>
-        <w:rPr>
-          <w:rFonts w:ascii="Times New Roman" w:eastAsia="Times New Roman" w:hAnsi="Times New Roman" w:cs="Times New Roman"/>
-          <w:b/>
-          <w:bCs/>
-          <w:kern w:val="36"/>
-          <w:sz w:val="48"/>
-          <w:szCs w:val="48"/>
-          <w:lang w:eastAsia="en-IN"/>
-          <w14:ligatures w14:val="none"/>
-        </w:rPr>
-      </w:pPr>
-      <w:r>
-        <w:rPr>
-          <w:rFonts w:ascii="Times New Roman" w:eastAsia="Times New Roman" w:hAnsi="Times New Roman" w:cs="Times New Roman"/>
-          <w:b/>
-          <w:bCs/>
-          <w:kern w:val="36"/>
-          <w:sz w:val="48"/>
-          <w:szCs w:val="48"/>
-          <w:lang w:eastAsia="en-IN"/>
-          <w14:ligatures w14:val="none"/>
-        </w:rPr>
-        <w:t>8️</w:t>
-      </w:r>
-      <w:r>
-        <w:rPr>
-          <w:rFonts w:ascii="Segoe UI Symbol" w:eastAsia="Times New Roman" w:hAnsi="Segoe UI Symbol" w:cs="Segoe UI Symbol"/>
-          <w:b/>
-          <w:bCs/>
-          <w:kern w:val="36"/>
-          <w:sz w:val="48"/>
-          <w:szCs w:val="48"/>
-          <w:lang w:eastAsia="en-IN"/>
-          <w14:ligatures w14:val="none"/>
-        </w:rPr>
-        <w:t>⃣</w:t>
-      </w:r>
-      <w:r>
-        <w:rPr>
-          <w:rFonts w:ascii="Times New Roman" w:eastAsia="Times New Roman" w:hAnsi="Times New Roman" w:cs="Times New Roman"/>
-          <w:b/>
-          <w:bCs/>
-          <w:kern w:val="36"/>
-          <w:sz w:val="48"/>
-          <w:szCs w:val="48"/>
-          <w:lang w:eastAsia="en-IN"/>
-          <w14:ligatures w14:val="none"/>
-        </w:rPr>
-        <w:t xml:space="preserve"> Run a playbook</w:t>
-      </w:r>
-    </w:p>
-    <w:p>
-      <w:pPr>
-        <w:spacing w:before="100" w:beforeAutospacing="1" w:after="100" w:afterAutospacing="1" w:line="240" w:lineRule="auto"/>
-        <w:rPr>
-          <w:rFonts w:ascii="Times New Roman" w:eastAsia="Times New Roman" w:hAnsi="Times New Roman" w:cs="Times New Roman"/>
-          <w:kern w:val="0"/>
-          <w:sz w:val="24"/>
-          <w:szCs w:val="24"/>
-          <w:lang w:eastAsia="en-IN"/>
-          <w14:ligatures w14:val="none"/>
-        </w:rPr>
-      </w:pPr>
-      <w:r>
-        <w:rPr>
-          <w:rFonts w:ascii="Times New Roman" w:eastAsia="Times New Roman" w:hAnsi="Times New Roman" w:cs="Times New Roman"/>
-          <w:kern w:val="0"/>
-          <w:sz w:val="24"/>
-          <w:szCs w:val="24"/>
-          <w:lang w:eastAsia="en-IN"/>
-          <w14:ligatures w14:val="none"/>
-        </w:rPr>
-        <w:t>Example:</w:t>
+        <w:rPr>
+          <w:rFonts w:ascii="Times New Roman" w:eastAsia="Times New Roman" w:hAnsi="Times New Roman" w:cs="Times New Roman"/>
+          <w:kern w:val="0"/>
+          <w:sz w:val="24"/>
+          <w:szCs w:val="24"/>
+          <w:lang w:eastAsia="en-IN"/>
+          <w14:ligatures w14:val="none"/>
+        </w:rPr>
+      </w:pPr>
+      <w:r>
+        <w:rPr>
+          <w:rFonts w:ascii="Times New Roman" w:eastAsia="Times New Roman" w:hAnsi="Times New Roman" w:cs="Times New Roman"/>
+          <w:kern w:val="0"/>
+          <w:sz w:val="24"/>
+          <w:szCs w:val="24"/>
+          <w:lang w:eastAsia="en-IN"/>
+          <w14:ligatures w14:val="none"/>
+        </w:rPr>
+        <w:t>Expected:</w:t>
       </w:r>
     </w:p>
     <w:p>
@@ -1905,7 +2222,8 @@
           <w:lang w:eastAsia="en-IN"/>
           <w14:ligatures w14:val="none"/>
         </w:rPr>
-        <w:t>---</w:t>
+        <w:lastRenderedPageBreak/>
+        <w:t>10.0.1.18 | SUCCESS =&gt; {</w:t>
       </w:r>
       <w:r>
         <w:rPr>
@@ -1917,7 +2235,7 @@
           <w14:ligatures w14:val="none"/>
         </w:rPr>
         <w:br/>
-        <w:t>- name: Test playbook</w:t>
+        <w:t xml:space="preserve">    "ping": "pong"</w:t>
       </w:r>
       <w:r>
         <w:rPr>
@@ -1929,90 +2247,112 @@
           <w14:ligatures w14:val="none"/>
         </w:rPr>
         <w:br/>
-        <w:t xml:space="preserve">  hosts: env_ansible_slave</w:t>
-      </w:r>
-      <w:r>
-        <w:rPr>
-          <w:rFonts w:ascii="Courier New" w:eastAsia="Times New Roman" w:hAnsi="Courier New" w:cs="Courier New"/>
-          <w:kern w:val="0"/>
-          <w:sz w:val="20"/>
-          <w:szCs w:val="20"/>
-          <w:lang w:eastAsia="en-IN"/>
-          <w14:ligatures w14:val="none"/>
-        </w:rPr>
-        <w:br/>
-        <w:t xml:space="preserve">  become: yes</w:t>
-      </w:r>
-      <w:r>
-        <w:rPr>
-          <w:rFonts w:ascii="Courier New" w:eastAsia="Times New Roman" w:hAnsi="Courier New" w:cs="Courier New"/>
-          <w:kern w:val="0"/>
-          <w:sz w:val="20"/>
-          <w:szCs w:val="20"/>
-          <w:lang w:eastAsia="en-IN"/>
-          <w14:ligatures w14:val="none"/>
-        </w:rPr>
-        <w:br/>
-      </w:r>
-      <w:r>
-        <w:rPr>
-          <w:rFonts w:ascii="Courier New" w:eastAsia="Times New Roman" w:hAnsi="Courier New" w:cs="Courier New"/>
-          <w:kern w:val="0"/>
-          <w:sz w:val="20"/>
-          <w:szCs w:val="20"/>
-          <w:lang w:eastAsia="en-IN"/>
-          <w14:ligatures w14:val="none"/>
-        </w:rPr>
-        <w:br/>
-        <w:t xml:space="preserve">  tasks:</w:t>
-      </w:r>
-      <w:r>
-        <w:rPr>
-          <w:rFonts w:ascii="Courier New" w:eastAsia="Times New Roman" w:hAnsi="Courier New" w:cs="Courier New"/>
-          <w:kern w:val="0"/>
-          <w:sz w:val="20"/>
-          <w:szCs w:val="20"/>
-          <w:lang w:eastAsia="en-IN"/>
-          <w14:ligatures w14:val="none"/>
-        </w:rPr>
-        <w:br/>
-        <w:t xml:space="preserve">    - name: check uptime</w:t>
-      </w:r>
-      <w:r>
-        <w:rPr>
-          <w:rFonts w:ascii="Courier New" w:eastAsia="Times New Roman" w:hAnsi="Courier New" w:cs="Courier New"/>
-          <w:kern w:val="0"/>
-          <w:sz w:val="20"/>
-          <w:szCs w:val="20"/>
-          <w:lang w:eastAsia="en-IN"/>
-          <w14:ligatures w14:val="none"/>
-        </w:rPr>
-        <w:br/>
-        <w:t xml:space="preserve">      command: uptime</w:t>
+        <w:t>}</w:t>
+      </w:r>
+    </w:p>
+    <w:p>
+      <w:pPr>
+        <w:spacing w:after="0" w:line="240" w:lineRule="auto"/>
+        <w:rPr>
+          <w:rFonts w:ascii="Times New Roman" w:eastAsia="Times New Roman" w:hAnsi="Times New Roman" w:cs="Times New Roman"/>
+          <w:kern w:val="0"/>
+          <w:sz w:val="24"/>
+          <w:szCs w:val="24"/>
+          <w:lang w:eastAsia="en-IN"/>
+          <w14:ligatures w14:val="none"/>
+        </w:rPr>
+      </w:pPr>
+      <w:r>
+        <w:rPr>
+          <w:rFonts w:ascii="Times New Roman" w:eastAsia="Times New Roman" w:hAnsi="Times New Roman" w:cs="Times New Roman"/>
+          <w:kern w:val="0"/>
+          <w:sz w:val="24"/>
+          <w:szCs w:val="24"/>
+          <w:lang w:eastAsia="en-IN"/>
+          <w14:ligatures w14:val="none"/>
+        </w:rPr>
+        <w:pict w14:anchorId="583B9C33">
+          <v:rect id="_x0000_i1031" style="width:0;height:1.5pt" o:hralign="center" o:hrstd="t" o:hr="t" fillcolor="#a0a0a0" stroked="f"/>
+        </w:pict>
       </w:r>
     </w:p>
     <w:p>
       <w:pPr>
         <w:spacing w:before="100" w:beforeAutospacing="1" w:after="100" w:afterAutospacing="1" w:line="240" w:lineRule="auto"/>
-        <w:rPr>
-          <w:rFonts w:ascii="Times New Roman" w:eastAsia="Times New Roman" w:hAnsi="Times New Roman" w:cs="Times New Roman"/>
-          <w:kern w:val="0"/>
-          <w:sz w:val="24"/>
-          <w:szCs w:val="24"/>
-          <w:lang w:eastAsia="en-IN"/>
-          <w14:ligatures w14:val="none"/>
-        </w:rPr>
-      </w:pPr>
-      <w:r>
-        <w:rPr>
-          <w:rFonts w:ascii="Times New Roman" w:eastAsia="Times New Roman" w:hAnsi="Times New Roman" w:cs="Times New Roman"/>
-          <w:kern w:val="0"/>
-          <w:sz w:val="24"/>
-          <w:szCs w:val="24"/>
-          <w:lang w:eastAsia="en-IN"/>
-          <w14:ligatures w14:val="none"/>
-        </w:rPr>
-        <w:t>Run:</w:t>
+        <w:outlineLvl w:val="0"/>
+        <w:rPr>
+          <w:rFonts w:ascii="Times New Roman" w:eastAsia="Times New Roman" w:hAnsi="Times New Roman" w:cs="Times New Roman"/>
+          <w:b/>
+          <w:bCs/>
+          <w:kern w:val="36"/>
+          <w:sz w:val="48"/>
+          <w:szCs w:val="48"/>
+          <w:lang w:eastAsia="en-IN"/>
+          <w14:ligatures w14:val="none"/>
+        </w:rPr>
+      </w:pPr>
+      <w:r>
+        <w:rPr>
+          <w:rFonts w:ascii="Times New Roman" w:eastAsia="Times New Roman" w:hAnsi="Times New Roman" w:cs="Times New Roman"/>
+          <w:b/>
+          <w:bCs/>
+          <w:kern w:val="36"/>
+          <w:sz w:val="48"/>
+          <w:szCs w:val="48"/>
+          <w:lang w:eastAsia="en-IN"/>
+          <w14:ligatures w14:val="none"/>
+        </w:rPr>
+        <w:t>8️</w:t>
+      </w:r>
+      <w:r>
+        <w:rPr>
+          <w:rFonts w:ascii="Segoe UI Symbol" w:eastAsia="Times New Roman" w:hAnsi="Segoe UI Symbol" w:cs="Segoe UI Symbol"/>
+          <w:b/>
+          <w:bCs/>
+          <w:kern w:val="36"/>
+          <w:sz w:val="48"/>
+          <w:szCs w:val="48"/>
+          <w:lang w:eastAsia="en-IN"/>
+          <w14:ligatures w14:val="none"/>
+        </w:rPr>
+        <w:t>⃣</w:t>
+      </w:r>
+      <w:r>
+        <w:rPr>
+          <w:rFonts w:ascii="Times New Roman" w:eastAsia="Times New Roman" w:hAnsi="Times New Roman" w:cs="Times New Roman"/>
+          <w:b/>
+          <w:bCs/>
+          <w:kern w:val="36"/>
+          <w:sz w:val="48"/>
+          <w:szCs w:val="48"/>
+          <w:lang w:eastAsia="en-IN"/>
+          <w14:ligatures w14:val="none"/>
+        </w:rPr>
+        <w:t xml:space="preserve"> Run a playbook</w:t>
+      </w:r>
+    </w:p>
+    <w:p>
+      <w:pPr>
+        <w:spacing w:before="100" w:beforeAutospacing="1" w:after="100" w:afterAutospacing="1" w:line="240" w:lineRule="auto"/>
+        <w:rPr>
+          <w:rFonts w:ascii="Times New Roman" w:eastAsia="Times New Roman" w:hAnsi="Times New Roman" w:cs="Times New Roman"/>
+          <w:kern w:val="0"/>
+          <w:sz w:val="24"/>
+          <w:szCs w:val="24"/>
+          <w:lang w:eastAsia="en-IN"/>
+          <w14:ligatures w14:val="none"/>
+        </w:rPr>
+      </w:pPr>
+      <w:r>
+        <w:rPr>
+          <w:rFonts w:ascii="Times New Roman" w:eastAsia="Times New Roman" w:hAnsi="Times New Roman" w:cs="Times New Roman"/>
+          <w:kern w:val="0"/>
+          <w:sz w:val="24"/>
+          <w:szCs w:val="24"/>
+          <w:lang w:eastAsia="en-IN"/>
+          <w14:ligatures w14:val="none"/>
+        </w:rPr>
+        <w:t>Example:</w:t>
       </w:r>
     </w:p>
     <w:p>
@@ -2054,75 +2394,127 @@
           <w:lang w:eastAsia="en-IN"/>
           <w14:ligatures w14:val="none"/>
         </w:rPr>
-        <w:t>ansible-playbook -i aws_ec2.yml playbook.yml -u ubuntu --private-key ~/keys/mykey.pem</w:t>
-      </w:r>
-    </w:p>
-    <w:p>
-      <w:pPr>
-        <w:spacing w:after="0" w:line="240" w:lineRule="auto"/>
-        <w:rPr>
-          <w:rFonts w:ascii="Times New Roman" w:eastAsia="Times New Roman" w:hAnsi="Times New Roman" w:cs="Times New Roman"/>
-          <w:kern w:val="0"/>
-          <w:sz w:val="24"/>
-          <w:szCs w:val="24"/>
-          <w:lang w:eastAsia="en-IN"/>
-          <w14:ligatures w14:val="none"/>
-        </w:rPr>
-      </w:pPr>
-      <w:r>
-        <w:rPr>
-          <w:rFonts w:ascii="Times New Roman" w:eastAsia="Times New Roman" w:hAnsi="Times New Roman" w:cs="Times New Roman"/>
-          <w:kern w:val="0"/>
-          <w:sz w:val="24"/>
-          <w:szCs w:val="24"/>
-          <w:lang w:eastAsia="en-IN"/>
-          <w14:ligatures w14:val="none"/>
-        </w:rPr>
-        <w:pict w14:anchorId="12EBFF9C">
-          <v:rect id="_x0000_i1032" style="width:0;height:1.5pt" o:hralign="center" o:hrstd="t" o:hr="t" fillcolor="#a0a0a0" stroked="f"/>
-        </w:pict>
+        <w:t>---</w:t>
+      </w:r>
+      <w:r>
+        <w:rPr>
+          <w:rFonts w:ascii="Courier New" w:eastAsia="Times New Roman" w:hAnsi="Courier New" w:cs="Courier New"/>
+          <w:kern w:val="0"/>
+          <w:sz w:val="20"/>
+          <w:szCs w:val="20"/>
+          <w:lang w:eastAsia="en-IN"/>
+          <w14:ligatures w14:val="none"/>
+        </w:rPr>
+        <w:br/>
+        <w:t>- name: Test playbook</w:t>
+      </w:r>
+      <w:r>
+        <w:rPr>
+          <w:rFonts w:ascii="Courier New" w:eastAsia="Times New Roman" w:hAnsi="Courier New" w:cs="Courier New"/>
+          <w:kern w:val="0"/>
+          <w:sz w:val="20"/>
+          <w:szCs w:val="20"/>
+          <w:lang w:eastAsia="en-IN"/>
+          <w14:ligatures w14:val="none"/>
+        </w:rPr>
+        <w:br/>
+        <w:t xml:space="preserve">  hosts: </w:t>
+      </w:r>
+      <w:proofErr w:type="spellStart"/>
+      <w:r>
+        <w:rPr>
+          <w:rFonts w:ascii="Courier New" w:eastAsia="Times New Roman" w:hAnsi="Courier New" w:cs="Courier New"/>
+          <w:kern w:val="0"/>
+          <w:sz w:val="20"/>
+          <w:szCs w:val="20"/>
+          <w:lang w:eastAsia="en-IN"/>
+          <w14:ligatures w14:val="none"/>
+        </w:rPr>
+        <w:t>env_ansible_slave</w:t>
+      </w:r>
+      <w:proofErr w:type="spellEnd"/>
+      <w:r>
+        <w:rPr>
+          <w:rFonts w:ascii="Courier New" w:eastAsia="Times New Roman" w:hAnsi="Courier New" w:cs="Courier New"/>
+          <w:kern w:val="0"/>
+          <w:sz w:val="20"/>
+          <w:szCs w:val="20"/>
+          <w:lang w:eastAsia="en-IN"/>
+          <w14:ligatures w14:val="none"/>
+        </w:rPr>
+        <w:br/>
+        <w:t xml:space="preserve">  become: yes</w:t>
+      </w:r>
+      <w:r>
+        <w:rPr>
+          <w:rFonts w:ascii="Courier New" w:eastAsia="Times New Roman" w:hAnsi="Courier New" w:cs="Courier New"/>
+          <w:kern w:val="0"/>
+          <w:sz w:val="20"/>
+          <w:szCs w:val="20"/>
+          <w:lang w:eastAsia="en-IN"/>
+          <w14:ligatures w14:val="none"/>
+        </w:rPr>
+        <w:br/>
+      </w:r>
+      <w:r>
+        <w:rPr>
+          <w:rFonts w:ascii="Courier New" w:eastAsia="Times New Roman" w:hAnsi="Courier New" w:cs="Courier New"/>
+          <w:kern w:val="0"/>
+          <w:sz w:val="20"/>
+          <w:szCs w:val="20"/>
+          <w:lang w:eastAsia="en-IN"/>
+          <w14:ligatures w14:val="none"/>
+        </w:rPr>
+        <w:br/>
+        <w:t xml:space="preserve">  tasks:</w:t>
+      </w:r>
+      <w:r>
+        <w:rPr>
+          <w:rFonts w:ascii="Courier New" w:eastAsia="Times New Roman" w:hAnsi="Courier New" w:cs="Courier New"/>
+          <w:kern w:val="0"/>
+          <w:sz w:val="20"/>
+          <w:szCs w:val="20"/>
+          <w:lang w:eastAsia="en-IN"/>
+          <w14:ligatures w14:val="none"/>
+        </w:rPr>
+        <w:br/>
+        <w:t xml:space="preserve">    - name: check uptime</w:t>
+      </w:r>
+      <w:r>
+        <w:rPr>
+          <w:rFonts w:ascii="Courier New" w:eastAsia="Times New Roman" w:hAnsi="Courier New" w:cs="Courier New"/>
+          <w:kern w:val="0"/>
+          <w:sz w:val="20"/>
+          <w:szCs w:val="20"/>
+          <w:lang w:eastAsia="en-IN"/>
+          <w14:ligatures w14:val="none"/>
+        </w:rPr>
+        <w:br/>
+        <w:t xml:space="preserve">      command: uptime</w:t>
       </w:r>
     </w:p>
     <w:p>
       <w:pPr>
         <w:spacing w:before="100" w:beforeAutospacing="1" w:after="100" w:afterAutospacing="1" w:line="240" w:lineRule="auto"/>
-        <w:outlineLvl w:val="0"/>
-        <w:rPr>
-          <w:rFonts w:ascii="Times New Roman" w:eastAsia="Times New Roman" w:hAnsi="Times New Roman" w:cs="Times New Roman"/>
-          <w:b/>
-          <w:bCs/>
-          <w:kern w:val="36"/>
-          <w:sz w:val="48"/>
-          <w:szCs w:val="48"/>
-          <w:lang w:eastAsia="en-IN"/>
-          <w14:ligatures w14:val="none"/>
-        </w:rPr>
-      </w:pPr>
-      <w:r>
-        <w:rPr>
-          <w:rFonts w:ascii="Segoe UI Emoji" w:eastAsia="Times New Roman" w:hAnsi="Segoe UI Emoji" w:cs="Segoe UI Emoji"/>
-          <w:b/>
-          <w:bCs/>
-          <w:kern w:val="36"/>
-          <w:sz w:val="48"/>
-          <w:szCs w:val="48"/>
-          <w:lang w:eastAsia="en-IN"/>
-          <w14:ligatures w14:val="none"/>
-        </w:rPr>
-        <w:t>⭐</w:t>
-      </w:r>
-      <w:r>
-        <w:rPr>
-          <w:rFonts w:ascii="Times New Roman" w:eastAsia="Times New Roman" w:hAnsi="Times New Roman" w:cs="Times New Roman"/>
-          <w:b/>
-          <w:bCs/>
-          <w:kern w:val="36"/>
-          <w:sz w:val="48"/>
-          <w:szCs w:val="48"/>
-          <w:lang w:eastAsia="en-IN"/>
-          <w14:ligatures w14:val="none"/>
-        </w:rPr>
-        <w:t xml:space="preserve"> Final Workflow (Quick Memory)</w:t>
+        <w:rPr>
+          <w:rFonts w:ascii="Times New Roman" w:eastAsia="Times New Roman" w:hAnsi="Times New Roman" w:cs="Times New Roman"/>
+          <w:kern w:val="0"/>
+          <w:sz w:val="24"/>
+          <w:szCs w:val="24"/>
+          <w:lang w:eastAsia="en-IN"/>
+          <w14:ligatures w14:val="none"/>
+        </w:rPr>
+      </w:pPr>
+      <w:r>
+        <w:rPr>
+          <w:rFonts w:ascii="Times New Roman" w:eastAsia="Times New Roman" w:hAnsi="Times New Roman" w:cs="Times New Roman"/>
+          <w:kern w:val="0"/>
+          <w:sz w:val="24"/>
+          <w:szCs w:val="24"/>
+          <w:lang w:eastAsia="en-IN"/>
+          <w14:ligatures w14:val="none"/>
+        </w:rPr>
+        <w:t>Run:</w:t>
       </w:r>
     </w:p>
     <w:p>
@@ -2164,8 +2556,399 @@
           <w:lang w:eastAsia="en-IN"/>
           <w14:ligatures w14:val="none"/>
         </w:rPr>
-        <w:t>1 Install boto3 + awscli</w:t>
-      </w:r>
+        <w:t>ansible-playbook -</w:t>
+      </w:r>
+      <w:proofErr w:type="spellStart"/>
+      <w:r>
+        <w:rPr>
+          <w:rFonts w:ascii="Courier New" w:eastAsia="Times New Roman" w:hAnsi="Courier New" w:cs="Courier New"/>
+          <w:kern w:val="0"/>
+          <w:sz w:val="20"/>
+          <w:szCs w:val="20"/>
+          <w:lang w:eastAsia="en-IN"/>
+          <w14:ligatures w14:val="none"/>
+        </w:rPr>
+        <w:t>i</w:t>
+      </w:r>
+      <w:proofErr w:type="spellEnd"/>
+      <w:r>
+        <w:rPr>
+          <w:rFonts w:ascii="Courier New" w:eastAsia="Times New Roman" w:hAnsi="Courier New" w:cs="Courier New"/>
+          <w:kern w:val="0"/>
+          <w:sz w:val="20"/>
+          <w:szCs w:val="20"/>
+          <w:lang w:eastAsia="en-IN"/>
+          <w14:ligatures w14:val="none"/>
+        </w:rPr>
+        <w:t xml:space="preserve"> aws_ec2.yml </w:t>
+      </w:r>
+      <w:proofErr w:type="spellStart"/>
+      <w:r>
+        <w:rPr>
+          <w:rFonts w:ascii="Courier New" w:eastAsia="Times New Roman" w:hAnsi="Courier New" w:cs="Courier New"/>
+          <w:kern w:val="0"/>
+          <w:sz w:val="20"/>
+          <w:szCs w:val="20"/>
+          <w:lang w:eastAsia="en-IN"/>
+          <w14:ligatures w14:val="none"/>
+        </w:rPr>
+        <w:t>playbook.yml</w:t>
+      </w:r>
+      <w:proofErr w:type="spellEnd"/>
+      <w:r>
+        <w:rPr>
+          <w:rFonts w:ascii="Courier New" w:eastAsia="Times New Roman" w:hAnsi="Courier New" w:cs="Courier New"/>
+          <w:kern w:val="0"/>
+          <w:sz w:val="20"/>
+          <w:szCs w:val="20"/>
+          <w:lang w:eastAsia="en-IN"/>
+          <w14:ligatures w14:val="none"/>
+        </w:rPr>
+        <w:t xml:space="preserve"> -u ubuntu --private-key ~/keys/</w:t>
+      </w:r>
+      <w:proofErr w:type="spellStart"/>
+      <w:r>
+        <w:rPr>
+          <w:rFonts w:ascii="Courier New" w:eastAsia="Times New Roman" w:hAnsi="Courier New" w:cs="Courier New"/>
+          <w:kern w:val="0"/>
+          <w:sz w:val="20"/>
+          <w:szCs w:val="20"/>
+          <w:lang w:eastAsia="en-IN"/>
+          <w14:ligatures w14:val="none"/>
+        </w:rPr>
+        <w:t>mykey.pem</w:t>
+      </w:r>
+      <w:proofErr w:type="spellEnd"/>
+    </w:p>
+    <w:p>
+      <w:pPr>
+        <w:tabs>
+          <w:tab w:val="left" w:pos="916"/>
+          <w:tab w:val="left" w:pos="1832"/>
+          <w:tab w:val="left" w:pos="2748"/>
+          <w:tab w:val="left" w:pos="3664"/>
+          <w:tab w:val="left" w:pos="4580"/>
+          <w:tab w:val="left" w:pos="5496"/>
+          <w:tab w:val="left" w:pos="6412"/>
+          <w:tab w:val="left" w:pos="7328"/>
+          <w:tab w:val="left" w:pos="8244"/>
+          <w:tab w:val="left" w:pos="9160"/>
+          <w:tab w:val="left" w:pos="10076"/>
+          <w:tab w:val="left" w:pos="10992"/>
+          <w:tab w:val="left" w:pos="11908"/>
+          <w:tab w:val="left" w:pos="12824"/>
+          <w:tab w:val="left" w:pos="13740"/>
+          <w:tab w:val="left" w:pos="14656"/>
+        </w:tabs>
+        <w:spacing w:after="0" w:line="240" w:lineRule="auto"/>
+        <w:rPr>
+          <w:rFonts w:ascii="Courier New" w:eastAsia="Times New Roman" w:hAnsi="Courier New" w:cs="Courier New"/>
+          <w:kern w:val="0"/>
+          <w:sz w:val="20"/>
+          <w:szCs w:val="20"/>
+          <w:lang w:eastAsia="en-IN"/>
+          <w14:ligatures w14:val="none"/>
+        </w:rPr>
+      </w:pPr>
+    </w:p>
+    <w:p>
+      <w:pPr>
+        <w:tabs>
+          <w:tab w:val="left" w:pos="916"/>
+          <w:tab w:val="left" w:pos="1832"/>
+          <w:tab w:val="left" w:pos="2748"/>
+          <w:tab w:val="left" w:pos="3664"/>
+          <w:tab w:val="left" w:pos="4580"/>
+          <w:tab w:val="left" w:pos="5496"/>
+          <w:tab w:val="left" w:pos="6412"/>
+          <w:tab w:val="left" w:pos="7328"/>
+          <w:tab w:val="left" w:pos="8244"/>
+          <w:tab w:val="left" w:pos="9160"/>
+          <w:tab w:val="left" w:pos="10076"/>
+          <w:tab w:val="left" w:pos="10992"/>
+          <w:tab w:val="left" w:pos="11908"/>
+          <w:tab w:val="left" w:pos="12824"/>
+          <w:tab w:val="left" w:pos="13740"/>
+          <w:tab w:val="left" w:pos="14656"/>
+        </w:tabs>
+        <w:spacing w:after="0" w:line="240" w:lineRule="auto"/>
+        <w:rPr>
+          <w:rFonts w:ascii="Courier New" w:eastAsia="Times New Roman" w:hAnsi="Courier New" w:cs="Courier New"/>
+          <w:kern w:val="0"/>
+          <w:sz w:val="20"/>
+          <w:szCs w:val="20"/>
+          <w:lang w:eastAsia="en-IN"/>
+          <w14:ligatures w14:val="none"/>
+        </w:rPr>
+      </w:pPr>
+      <w:r>
+        <w:rPr>
+          <w:rFonts w:ascii="Courier New" w:eastAsia="Times New Roman" w:hAnsi="Courier New" w:cs="Courier New"/>
+          <w:kern w:val="0"/>
+          <w:sz w:val="20"/>
+          <w:szCs w:val="20"/>
+          <w:lang w:eastAsia="en-IN"/>
+          <w14:ligatures w14:val="none"/>
+        </w:rPr>
+        <w:t xml:space="preserve">if you added </w:t>
+      </w:r>
+      <w:proofErr w:type="spellStart"/>
+      <w:r>
+        <w:rPr>
+          <w:rFonts w:ascii="Courier New" w:eastAsia="Times New Roman" w:hAnsi="Courier New" w:cs="Courier New"/>
+          <w:kern w:val="0"/>
+          <w:sz w:val="20"/>
+          <w:szCs w:val="20"/>
+          <w:lang w:eastAsia="en-IN"/>
+          <w14:ligatures w14:val="none"/>
+        </w:rPr>
+        <w:t>pem</w:t>
+      </w:r>
+      <w:proofErr w:type="spellEnd"/>
+      <w:r>
+        <w:rPr>
+          <w:rFonts w:ascii="Courier New" w:eastAsia="Times New Roman" w:hAnsi="Courier New" w:cs="Courier New"/>
+          <w:kern w:val="0"/>
+          <w:sz w:val="20"/>
+          <w:szCs w:val="20"/>
+          <w:lang w:eastAsia="en-IN"/>
+          <w14:ligatures w14:val="none"/>
+        </w:rPr>
+        <w:t xml:space="preserve"> and user in config file then direct</w:t>
+      </w:r>
+    </w:p>
+    <w:p>
+      <w:pPr>
+        <w:tabs>
+          <w:tab w:val="left" w:pos="916"/>
+          <w:tab w:val="left" w:pos="1832"/>
+          <w:tab w:val="left" w:pos="2748"/>
+          <w:tab w:val="left" w:pos="3664"/>
+          <w:tab w:val="left" w:pos="4580"/>
+          <w:tab w:val="left" w:pos="5496"/>
+          <w:tab w:val="left" w:pos="6412"/>
+          <w:tab w:val="left" w:pos="7328"/>
+          <w:tab w:val="left" w:pos="8244"/>
+          <w:tab w:val="left" w:pos="9160"/>
+          <w:tab w:val="left" w:pos="10076"/>
+          <w:tab w:val="left" w:pos="10992"/>
+          <w:tab w:val="left" w:pos="11908"/>
+          <w:tab w:val="left" w:pos="12824"/>
+          <w:tab w:val="left" w:pos="13740"/>
+          <w:tab w:val="left" w:pos="14656"/>
+        </w:tabs>
+        <w:spacing w:after="0" w:line="240" w:lineRule="auto"/>
+        <w:rPr>
+          <w:rFonts w:ascii="Courier New" w:eastAsia="Times New Roman" w:hAnsi="Courier New" w:cs="Courier New"/>
+          <w:kern w:val="0"/>
+          <w:sz w:val="20"/>
+          <w:szCs w:val="20"/>
+          <w:lang w:eastAsia="en-IN"/>
+          <w14:ligatures w14:val="none"/>
+        </w:rPr>
+      </w:pPr>
+    </w:p>
+    <w:p>
+      <w:pPr>
+        <w:tabs>
+          <w:tab w:val="left" w:pos="916"/>
+          <w:tab w:val="left" w:pos="1832"/>
+          <w:tab w:val="left" w:pos="2748"/>
+          <w:tab w:val="left" w:pos="3664"/>
+          <w:tab w:val="left" w:pos="4580"/>
+          <w:tab w:val="left" w:pos="5496"/>
+          <w:tab w:val="left" w:pos="6412"/>
+          <w:tab w:val="left" w:pos="7328"/>
+          <w:tab w:val="left" w:pos="8244"/>
+          <w:tab w:val="left" w:pos="9160"/>
+          <w:tab w:val="left" w:pos="10076"/>
+          <w:tab w:val="left" w:pos="10992"/>
+          <w:tab w:val="left" w:pos="11908"/>
+          <w:tab w:val="left" w:pos="12824"/>
+          <w:tab w:val="left" w:pos="13740"/>
+          <w:tab w:val="left" w:pos="14656"/>
+        </w:tabs>
+        <w:spacing w:after="0" w:line="240" w:lineRule="auto"/>
+        <w:rPr>
+          <w:rFonts w:ascii="Courier New" w:eastAsia="Times New Roman" w:hAnsi="Courier New" w:cs="Courier New"/>
+          <w:kern w:val="0"/>
+          <w:sz w:val="20"/>
+          <w:szCs w:val="20"/>
+          <w:lang w:eastAsia="en-IN"/>
+          <w14:ligatures w14:val="none"/>
+        </w:rPr>
+      </w:pPr>
+      <w:r>
+        <w:rPr>
+          <w:rFonts w:ascii="Courier New" w:eastAsia="Times New Roman" w:hAnsi="Courier New" w:cs="Courier New"/>
+          <w:kern w:val="0"/>
+          <w:sz w:val="20"/>
+          <w:szCs w:val="20"/>
+          <w:lang w:eastAsia="en-IN"/>
+          <w14:ligatures w14:val="none"/>
+        </w:rPr>
+        <w:t>ansible-playbook -</w:t>
+      </w:r>
+      <w:proofErr w:type="spellStart"/>
+      <w:r>
+        <w:rPr>
+          <w:rFonts w:ascii="Courier New" w:eastAsia="Times New Roman" w:hAnsi="Courier New" w:cs="Courier New"/>
+          <w:kern w:val="0"/>
+          <w:sz w:val="20"/>
+          <w:szCs w:val="20"/>
+          <w:lang w:eastAsia="en-IN"/>
+          <w14:ligatures w14:val="none"/>
+        </w:rPr>
+        <w:t>i</w:t>
+      </w:r>
+      <w:proofErr w:type="spellEnd"/>
+      <w:r>
+        <w:rPr>
+          <w:rFonts w:ascii="Courier New" w:eastAsia="Times New Roman" w:hAnsi="Courier New" w:cs="Courier New"/>
+          <w:kern w:val="0"/>
+          <w:sz w:val="20"/>
+          <w:szCs w:val="20"/>
+          <w:lang w:eastAsia="en-IN"/>
+          <w14:ligatures w14:val="none"/>
+        </w:rPr>
+        <w:t xml:space="preserve"> aws_ec2.yml </w:t>
+      </w:r>
+      <w:proofErr w:type="spellStart"/>
+      <w:r>
+        <w:rPr>
+          <w:rFonts w:ascii="Courier New" w:eastAsia="Times New Roman" w:hAnsi="Courier New" w:cs="Courier New"/>
+          <w:kern w:val="0"/>
+          <w:sz w:val="20"/>
+          <w:szCs w:val="20"/>
+          <w:lang w:eastAsia="en-IN"/>
+          <w14:ligatures w14:val="none"/>
+        </w:rPr>
+        <w:t>playbook.yml</w:t>
+      </w:r>
+      <w:proofErr w:type="spellEnd"/>
+    </w:p>
+    <w:p>
+      <w:pPr>
+        <w:spacing w:after="0" w:line="240" w:lineRule="auto"/>
+        <w:rPr>
+          <w:rFonts w:ascii="Times New Roman" w:eastAsia="Times New Roman" w:hAnsi="Times New Roman" w:cs="Times New Roman"/>
+          <w:kern w:val="0"/>
+          <w:sz w:val="24"/>
+          <w:szCs w:val="24"/>
+          <w:lang w:eastAsia="en-IN"/>
+          <w14:ligatures w14:val="none"/>
+        </w:rPr>
+      </w:pPr>
+      <w:r>
+        <w:rPr>
+          <w:rFonts w:ascii="Times New Roman" w:eastAsia="Times New Roman" w:hAnsi="Times New Roman" w:cs="Times New Roman"/>
+          <w:kern w:val="0"/>
+          <w:sz w:val="24"/>
+          <w:szCs w:val="24"/>
+          <w:lang w:eastAsia="en-IN"/>
+          <w14:ligatures w14:val="none"/>
+        </w:rPr>
+        <w:pict w14:anchorId="583B9C34">
+          <v:rect id="_x0000_i1032" style="width:0;height:1.5pt" o:hralign="center" o:hrstd="t" o:hr="t" fillcolor="#a0a0a0" stroked="f"/>
+        </w:pict>
+      </w:r>
+    </w:p>
+    <w:p>
+      <w:pPr>
+        <w:spacing w:before="100" w:beforeAutospacing="1" w:after="100" w:afterAutospacing="1" w:line="240" w:lineRule="auto"/>
+        <w:outlineLvl w:val="0"/>
+        <w:rPr>
+          <w:rFonts w:ascii="Times New Roman" w:eastAsia="Times New Roman" w:hAnsi="Times New Roman" w:cs="Times New Roman"/>
+          <w:b/>
+          <w:bCs/>
+          <w:kern w:val="36"/>
+          <w:sz w:val="48"/>
+          <w:szCs w:val="48"/>
+          <w:lang w:eastAsia="en-IN"/>
+          <w14:ligatures w14:val="none"/>
+        </w:rPr>
+      </w:pPr>
+      <w:r>
+        <w:rPr>
+          <w:rFonts w:ascii="Segoe UI Emoji" w:eastAsia="Times New Roman" w:hAnsi="Segoe UI Emoji" w:cs="Segoe UI Emoji"/>
+          <w:b/>
+          <w:bCs/>
+          <w:kern w:val="36"/>
+          <w:sz w:val="48"/>
+          <w:szCs w:val="48"/>
+          <w:lang w:eastAsia="en-IN"/>
+          <w14:ligatures w14:val="none"/>
+        </w:rPr>
+        <w:t>⭐</w:t>
+      </w:r>
+      <w:r>
+        <w:rPr>
+          <w:rFonts w:ascii="Times New Roman" w:eastAsia="Times New Roman" w:hAnsi="Times New Roman" w:cs="Times New Roman"/>
+          <w:b/>
+          <w:bCs/>
+          <w:kern w:val="36"/>
+          <w:sz w:val="48"/>
+          <w:szCs w:val="48"/>
+          <w:lang w:eastAsia="en-IN"/>
+          <w14:ligatures w14:val="none"/>
+        </w:rPr>
+        <w:t xml:space="preserve"> Final Workflow (Quick Memory)</w:t>
+      </w:r>
+    </w:p>
+    <w:p>
+      <w:pPr>
+        <w:tabs>
+          <w:tab w:val="left" w:pos="916"/>
+          <w:tab w:val="left" w:pos="1832"/>
+          <w:tab w:val="left" w:pos="2748"/>
+          <w:tab w:val="left" w:pos="3664"/>
+          <w:tab w:val="left" w:pos="4580"/>
+          <w:tab w:val="left" w:pos="5496"/>
+          <w:tab w:val="left" w:pos="6412"/>
+          <w:tab w:val="left" w:pos="7328"/>
+          <w:tab w:val="left" w:pos="8244"/>
+          <w:tab w:val="left" w:pos="9160"/>
+          <w:tab w:val="left" w:pos="10076"/>
+          <w:tab w:val="left" w:pos="10992"/>
+          <w:tab w:val="left" w:pos="11908"/>
+          <w:tab w:val="left" w:pos="12824"/>
+          <w:tab w:val="left" w:pos="13740"/>
+          <w:tab w:val="left" w:pos="14656"/>
+        </w:tabs>
+        <w:spacing w:after="0" w:line="240" w:lineRule="auto"/>
+        <w:rPr>
+          <w:rFonts w:ascii="Courier New" w:eastAsia="Times New Roman" w:hAnsi="Courier New" w:cs="Courier New"/>
+          <w:kern w:val="0"/>
+          <w:sz w:val="20"/>
+          <w:szCs w:val="20"/>
+          <w:lang w:eastAsia="en-IN"/>
+          <w14:ligatures w14:val="none"/>
+        </w:rPr>
+      </w:pPr>
+      <w:r>
+        <w:rPr>
+          <w:rFonts w:ascii="Courier New" w:eastAsia="Times New Roman" w:hAnsi="Courier New" w:cs="Courier New"/>
+          <w:kern w:val="0"/>
+          <w:sz w:val="20"/>
+          <w:szCs w:val="20"/>
+          <w:lang w:eastAsia="en-IN"/>
+          <w14:ligatures w14:val="none"/>
+        </w:rPr>
+        <w:t xml:space="preserve">1 Install boto3 + </w:t>
+      </w:r>
+      <w:proofErr w:type="spellStart"/>
+      <w:r>
+        <w:rPr>
+          <w:rFonts w:ascii="Courier New" w:eastAsia="Times New Roman" w:hAnsi="Courier New" w:cs="Courier New"/>
+          <w:kern w:val="0"/>
+          <w:sz w:val="20"/>
+          <w:szCs w:val="20"/>
+          <w:lang w:eastAsia="en-IN"/>
+          <w14:ligatures w14:val="none"/>
+        </w:rPr>
+        <w:t>awscli</w:t>
+      </w:r>
+      <w:proofErr w:type="spellEnd"/>
       <w:r>
         <w:rPr>
           <w:rFonts w:ascii="Courier New" w:eastAsia="Times New Roman" w:hAnsi="Courier New" w:cs="Courier New"/>
@@ -2176,7 +2959,31 @@
           <w14:ligatures w14:val="none"/>
         </w:rPr>
         <w:br/>
-        <w:t>2 Install amazon.aws collection</w:t>
+        <w:t xml:space="preserve">2 Install </w:t>
+      </w:r>
+      <w:proofErr w:type="spellStart"/>
+      <w:r>
+        <w:rPr>
+          <w:rFonts w:ascii="Courier New" w:eastAsia="Times New Roman" w:hAnsi="Courier New" w:cs="Courier New"/>
+          <w:kern w:val="0"/>
+          <w:sz w:val="20"/>
+          <w:szCs w:val="20"/>
+          <w:lang w:eastAsia="en-IN"/>
+          <w14:ligatures w14:val="none"/>
+        </w:rPr>
+        <w:t>amazon.aws</w:t>
+      </w:r>
+      <w:proofErr w:type="spellEnd"/>
+      <w:r>
+        <w:rPr>
+          <w:rFonts w:ascii="Courier New" w:eastAsia="Times New Roman" w:hAnsi="Courier New" w:cs="Courier New"/>
+          <w:kern w:val="0"/>
+          <w:sz w:val="20"/>
+          <w:szCs w:val="20"/>
+          <w:lang w:eastAsia="en-IN"/>
+          <w14:ligatures w14:val="none"/>
+        </w:rPr>
+        <w:t xml:space="preserve"> collection</w:t>
       </w:r>
       <w:r>
         <w:rPr>
@@ -2212,8 +3019,21 @@
           <w14:ligatures w14:val="none"/>
         </w:rPr>
         <w:br/>
-        <w:t>5 Configure ansible.cfg</w:t>
-      </w:r>
+        <w:t xml:space="preserve">5 Configure </w:t>
+      </w:r>
+      <w:proofErr w:type="spellStart"/>
+      <w:r>
+        <w:rPr>
+          <w:rFonts w:ascii="Courier New" w:eastAsia="Times New Roman" w:hAnsi="Courier New" w:cs="Courier New"/>
+          <w:kern w:val="0"/>
+          <w:sz w:val="20"/>
+          <w:szCs w:val="20"/>
+          <w:lang w:eastAsia="en-IN"/>
+          <w14:ligatures w14:val="none"/>
+        </w:rPr>
+        <w:t>ansible.cfg</w:t>
+      </w:r>
+      <w:proofErr w:type="spellEnd"/>
       <w:r>
         <w:rPr>
           <w:rFonts w:ascii="Courier New" w:eastAsia="Times New Roman" w:hAnsi="Courier New" w:cs="Courier New"/>
@@ -2272,7 +3092,7 @@
           <w:lang w:eastAsia="en-IN"/>
           <w14:ligatures w14:val="none"/>
         </w:rPr>
-        <w:pict w14:anchorId="02B9C0F8">
+        <w:pict w14:anchorId="583B9C35">
           <v:rect id="_x0000_i1033" style="width:0;height:1.5pt" o:hralign="center" o:hrstd="t" o:hr="t" fillcolor="#a0a0a0" stroked="f"/>
         </w:pict>
       </w:r>
@@ -3265,7 +4085,6 @@
   <w:style w:type="character" w:default="1" w:styleId="DefaultParagraphFont">
     <w:name w:val="Default Paragraph Font"/>
     <w:uiPriority w:val="1"/>
-    <w:semiHidden/>
     <w:unhideWhenUsed/>
   </w:style>
   <w:style w:type="table" w:default="1" w:styleId="TableNormal">

</xml_diff>